<commit_message>
completed model fit table
</commit_message>
<xml_diff>
--- a/GMV_fit_indices.docx
+++ b/GMV_fit_indices.docx
@@ -52,7 +52,8 @@
     <w:tbl>
       <w:tblPr>
         <w:tblStyle w:val="TableGrid3"/>
-        <w:tblW w:w="14075" w:type="dxa"/>
+        <w:tblW w:w="14504" w:type="dxa"/>
+        <w:tblInd w:w="-761" w:type="dxa"/>
         <w:tblBorders>
           <w:top w:val="none" w:sz="0" w:space="0" w:color="auto"/>
           <w:left w:val="none" w:sz="0" w:space="0" w:color="auto"/>
@@ -64,23 +65,27 @@
         <w:tblLook w:val="04A0" w:firstRow="1" w:lastRow="0" w:firstColumn="1" w:lastColumn="0" w:noHBand="0" w:noVBand="1"/>
       </w:tblPr>
       <w:tblGrid>
-        <w:gridCol w:w="3605"/>
-        <w:gridCol w:w="1308"/>
-        <w:gridCol w:w="1309"/>
-        <w:gridCol w:w="1309"/>
-        <w:gridCol w:w="1309"/>
-        <w:gridCol w:w="1308"/>
-        <w:gridCol w:w="1309"/>
-        <w:gridCol w:w="1309"/>
-        <w:gridCol w:w="1309"/>
+        <w:gridCol w:w="2590"/>
+        <w:gridCol w:w="975"/>
+        <w:gridCol w:w="912"/>
+        <w:gridCol w:w="934"/>
+        <w:gridCol w:w="1108"/>
+        <w:gridCol w:w="982"/>
+        <w:gridCol w:w="934"/>
+        <w:gridCol w:w="1041"/>
+        <w:gridCol w:w="1041"/>
+        <w:gridCol w:w="1041"/>
+        <w:gridCol w:w="1091"/>
+        <w:gridCol w:w="924"/>
+        <w:gridCol w:w="931"/>
       </w:tblGrid>
       <w:tr>
         <w:trPr>
-          <w:trHeight w:val="332"/>
+          <w:trHeight w:val="334"/>
         </w:trPr>
         <w:tc>
           <w:tcPr>
-            <w:tcW w:w="3605" w:type="dxa"/>
+            <w:tcW w:w="2590" w:type="dxa"/>
             <w:tcBorders>
               <w:top w:val="single" w:sz="4" w:space="0" w:color="auto"/>
               <w:bottom w:val="single" w:sz="4" w:space="0" w:color="auto"/>
@@ -95,7 +100,7 @@
         </w:tc>
         <w:tc>
           <w:tcPr>
-            <w:tcW w:w="1308" w:type="dxa"/>
+            <w:tcW w:w="975" w:type="dxa"/>
             <w:tcBorders>
               <w:top w:val="single" w:sz="4" w:space="0" w:color="auto"/>
               <w:bottom w:val="single" w:sz="4" w:space="0" w:color="auto"/>
@@ -122,7 +127,7 @@
         </w:tc>
         <w:tc>
           <w:tcPr>
-            <w:tcW w:w="1309" w:type="dxa"/>
+            <w:tcW w:w="912" w:type="dxa"/>
             <w:tcBorders>
               <w:top w:val="single" w:sz="4" w:space="0" w:color="auto"/>
               <w:bottom w:val="single" w:sz="4" w:space="0" w:color="auto"/>
@@ -148,7 +153,7 @@
         </w:tc>
         <w:tc>
           <w:tcPr>
-            <w:tcW w:w="1309" w:type="dxa"/>
+            <w:tcW w:w="934" w:type="dxa"/>
             <w:tcBorders>
               <w:top w:val="single" w:sz="4" w:space="0" w:color="auto"/>
               <w:bottom w:val="single" w:sz="4" w:space="0" w:color="auto"/>
@@ -169,7 +174,7 @@
         </w:tc>
         <w:tc>
           <w:tcPr>
-            <w:tcW w:w="1309" w:type="dxa"/>
+            <w:tcW w:w="1108" w:type="dxa"/>
             <w:tcBorders>
               <w:top w:val="single" w:sz="4" w:space="0" w:color="auto"/>
               <w:bottom w:val="single" w:sz="4" w:space="0" w:color="auto"/>
@@ -181,13 +186,13 @@
               <w:jc w:val="center"/>
             </w:pPr>
             <w:r>
-              <w:t>RMSEA</w:t>
-            </w:r>
-          </w:p>
-        </w:tc>
-        <w:tc>
-          <w:tcPr>
-            <w:tcW w:w="1308" w:type="dxa"/>
+              <w:t>Scaling correction factor for MLR</w:t>
+            </w:r>
+          </w:p>
+        </w:tc>
+        <w:tc>
+          <w:tcPr>
+            <w:tcW w:w="982" w:type="dxa"/>
             <w:tcBorders>
               <w:top w:val="single" w:sz="4" w:space="0" w:color="auto"/>
               <w:bottom w:val="single" w:sz="4" w:space="0" w:color="auto"/>
@@ -199,13 +204,13 @@
               <w:jc w:val="center"/>
             </w:pPr>
             <w:r>
-              <w:t>CFI</w:t>
-            </w:r>
-          </w:p>
-        </w:tc>
-        <w:tc>
-          <w:tcPr>
-            <w:tcW w:w="1309" w:type="dxa"/>
+              <w:t>RMSEA</w:t>
+            </w:r>
+          </w:p>
+        </w:tc>
+        <w:tc>
+          <w:tcPr>
+            <w:tcW w:w="934" w:type="dxa"/>
             <w:tcBorders>
               <w:top w:val="single" w:sz="4" w:space="0" w:color="auto"/>
               <w:bottom w:val="single" w:sz="4" w:space="0" w:color="auto"/>
@@ -217,19 +222,13 @@
               <w:jc w:val="center"/>
             </w:pPr>
             <w:r>
-              <w:t>Δχ</w:t>
-            </w:r>
-            <w:r>
-              <w:rPr>
-                <w:vertAlign w:val="superscript"/>
-              </w:rPr>
-              <w:t>2</w:t>
-            </w:r>
-          </w:p>
-        </w:tc>
-        <w:tc>
-          <w:tcPr>
-            <w:tcW w:w="1309" w:type="dxa"/>
+              <w:t>CFI</w:t>
+            </w:r>
+          </w:p>
+        </w:tc>
+        <w:tc>
+          <w:tcPr>
+            <w:tcW w:w="1041" w:type="dxa"/>
             <w:tcBorders>
               <w:top w:val="single" w:sz="4" w:space="0" w:color="auto"/>
               <w:bottom w:val="single" w:sz="4" w:space="0" w:color="auto"/>
@@ -240,25 +239,20 @@
             <w:pPr>
               <w:jc w:val="center"/>
               <w:rPr>
-                <w:i/>
-              </w:rPr>
-            </w:pPr>
-            <w:proofErr w:type="spellStart"/>
-            <w:r>
-              <w:t>Δ</w:t>
-            </w:r>
-            <w:r>
-              <w:rPr>
-                <w:i/>
-              </w:rPr>
-              <w:t>df</w:t>
-            </w:r>
-            <w:proofErr w:type="spellEnd"/>
-          </w:p>
-        </w:tc>
-        <w:tc>
-          <w:tcPr>
-            <w:tcW w:w="1309" w:type="dxa"/>
+                <w:color w:val="000000"/>
+              </w:rPr>
+            </w:pPr>
+            <w:r>
+              <w:rPr>
+                <w:color w:val="000000"/>
+              </w:rPr>
+              <w:t>AIC</w:t>
+            </w:r>
+          </w:p>
+        </w:tc>
+        <w:tc>
+          <w:tcPr>
+            <w:tcW w:w="1041" w:type="dxa"/>
             <w:tcBorders>
               <w:top w:val="single" w:sz="4" w:space="0" w:color="auto"/>
               <w:bottom w:val="single" w:sz="4" w:space="0" w:color="auto"/>
@@ -268,6 +262,153 @@
           <w:p>
             <w:pPr>
               <w:jc w:val="center"/>
+              <w:rPr>
+                <w:color w:val="000000"/>
+              </w:rPr>
+            </w:pPr>
+            <w:r>
+              <w:rPr>
+                <w:color w:val="000000"/>
+              </w:rPr>
+              <w:t>BIC</w:t>
+            </w:r>
+          </w:p>
+        </w:tc>
+        <w:tc>
+          <w:tcPr>
+            <w:tcW w:w="1041" w:type="dxa"/>
+            <w:tcBorders>
+              <w:top w:val="single" w:sz="4" w:space="0" w:color="auto"/>
+              <w:bottom w:val="single" w:sz="4" w:space="0" w:color="auto"/>
+            </w:tcBorders>
+            <w:vAlign w:val="center"/>
+          </w:tcPr>
+          <w:p>
+            <w:pPr>
+              <w:jc w:val="center"/>
+              <w:rPr>
+                <w:color w:val="000000"/>
+              </w:rPr>
+            </w:pPr>
+            <w:r>
+              <w:rPr>
+                <w:color w:val="000000"/>
+              </w:rPr>
+              <w:t>SABIC</w:t>
+            </w:r>
+          </w:p>
+        </w:tc>
+        <w:tc>
+          <w:tcPr>
+            <w:tcW w:w="1091" w:type="dxa"/>
+            <w:tcBorders>
+              <w:top w:val="single" w:sz="4" w:space="0" w:color="auto"/>
+              <w:bottom w:val="single" w:sz="4" w:space="0" w:color="auto"/>
+            </w:tcBorders>
+            <w:vAlign w:val="center"/>
+          </w:tcPr>
+          <w:p>
+            <w:pPr>
+              <w:jc w:val="center"/>
+              <w:rPr>
+                <w:rFonts w:ascii="Calibri" w:hAnsi="Calibri" w:cs="Calibri"/>
+                <w:color w:val="000000"/>
+              </w:rPr>
+            </w:pPr>
+            <w:commentRangeStart w:id="0"/>
+            <w:proofErr w:type="spellStart"/>
+            <w:r>
+              <w:rPr>
+                <w:color w:val="000000"/>
+              </w:rPr>
+              <w:t>Satorra-Bentler</w:t>
+            </w:r>
+            <w:proofErr w:type="spellEnd"/>
+            <w:r>
+              <w:rPr>
+                <w:color w:val="000000"/>
+              </w:rPr>
+              <w:t xml:space="preserve"> Scaled Chi Sq </w:t>
+            </w:r>
+            <w:r>
+              <w:rPr>
+                <w:rFonts w:ascii="Calibri" w:hAnsi="Calibri" w:cs="Calibri"/>
+                <w:color w:val="000000"/>
+              </w:rPr>
+              <w:t>(</w:t>
+            </w:r>
+            <w:r>
+              <w:rPr>
+                <w:rFonts w:ascii="Symbol" w:hAnsi="Symbol" w:cs="Calibri"/>
+                <w:color w:val="000000"/>
+              </w:rPr>
+              <w:t>Dc</w:t>
+            </w:r>
+            <w:r>
+              <w:rPr>
+                <w:rFonts w:ascii="Symbol" w:hAnsi="Symbol" w:cs="Calibri"/>
+                <w:color w:val="000000"/>
+                <w:vertAlign w:val="superscript"/>
+              </w:rPr>
+              <w:t>2</w:t>
+            </w:r>
+            <w:r>
+              <w:rPr>
+                <w:rFonts w:ascii="Symbol" w:hAnsi="Symbol" w:cs="Calibri"/>
+                <w:color w:val="000000"/>
+              </w:rPr>
+              <w:t>)</w:t>
+            </w:r>
+            <w:commentRangeEnd w:id="0"/>
+            <w:r>
+              <w:rPr>
+                <w:rStyle w:val="CommentReference"/>
+              </w:rPr>
+              <w:commentReference w:id="0"/>
+            </w:r>
+          </w:p>
+        </w:tc>
+        <w:tc>
+          <w:tcPr>
+            <w:tcW w:w="924" w:type="dxa"/>
+            <w:tcBorders>
+              <w:top w:val="single" w:sz="4" w:space="0" w:color="auto"/>
+              <w:bottom w:val="single" w:sz="4" w:space="0" w:color="auto"/>
+            </w:tcBorders>
+            <w:vAlign w:val="center"/>
+          </w:tcPr>
+          <w:p>
+            <w:pPr>
+              <w:jc w:val="center"/>
+              <w:rPr>
+                <w:i/>
+              </w:rPr>
+            </w:pPr>
+            <w:proofErr w:type="spellStart"/>
+            <w:r>
+              <w:t>Δ</w:t>
+            </w:r>
+            <w:r>
+              <w:rPr>
+                <w:i/>
+              </w:rPr>
+              <w:t>df</w:t>
+            </w:r>
+            <w:proofErr w:type="spellEnd"/>
+          </w:p>
+        </w:tc>
+        <w:tc>
+          <w:tcPr>
+            <w:tcW w:w="931" w:type="dxa"/>
+            <w:tcBorders>
+              <w:top w:val="single" w:sz="4" w:space="0" w:color="auto"/>
+              <w:bottom w:val="single" w:sz="4" w:space="0" w:color="auto"/>
+            </w:tcBorders>
+            <w:vAlign w:val="center"/>
+          </w:tcPr>
+          <w:p>
+            <w:pPr>
+              <w:jc w:val="center"/>
             </w:pPr>
             <w:r>
               <w:rPr>
@@ -283,11 +424,11 @@
       </w:tr>
       <w:tr>
         <w:trPr>
-          <w:trHeight w:val="314"/>
+          <w:trHeight w:val="315"/>
         </w:trPr>
         <w:tc>
           <w:tcPr>
-            <w:tcW w:w="3605" w:type="dxa"/>
+            <w:tcW w:w="2590" w:type="dxa"/>
             <w:tcBorders>
               <w:top w:val="single" w:sz="4" w:space="0" w:color="auto"/>
             </w:tcBorders>
@@ -304,7 +445,7 @@
         </w:tc>
         <w:tc>
           <w:tcPr>
-            <w:tcW w:w="1308" w:type="dxa"/>
+            <w:tcW w:w="975" w:type="dxa"/>
             <w:tcBorders>
               <w:top w:val="single" w:sz="4" w:space="0" w:color="auto"/>
             </w:tcBorders>
@@ -318,7 +459,7 @@
         </w:tc>
         <w:tc>
           <w:tcPr>
-            <w:tcW w:w="1309" w:type="dxa"/>
+            <w:tcW w:w="912" w:type="dxa"/>
             <w:tcBorders>
               <w:top w:val="single" w:sz="4" w:space="0" w:color="auto"/>
             </w:tcBorders>
@@ -332,7 +473,7 @@
         </w:tc>
         <w:tc>
           <w:tcPr>
-            <w:tcW w:w="1309" w:type="dxa"/>
+            <w:tcW w:w="934" w:type="dxa"/>
             <w:tcBorders>
               <w:top w:val="single" w:sz="4" w:space="0" w:color="auto"/>
             </w:tcBorders>
@@ -346,7 +487,7 @@
         </w:tc>
         <w:tc>
           <w:tcPr>
-            <w:tcW w:w="1309" w:type="dxa"/>
+            <w:tcW w:w="1108" w:type="dxa"/>
             <w:tcBorders>
               <w:top w:val="single" w:sz="4" w:space="0" w:color="auto"/>
             </w:tcBorders>
@@ -360,7 +501,7 @@
         </w:tc>
         <w:tc>
           <w:tcPr>
-            <w:tcW w:w="1308" w:type="dxa"/>
+            <w:tcW w:w="982" w:type="dxa"/>
             <w:tcBorders>
               <w:top w:val="single" w:sz="4" w:space="0" w:color="auto"/>
             </w:tcBorders>
@@ -374,7 +515,7 @@
         </w:tc>
         <w:tc>
           <w:tcPr>
-            <w:tcW w:w="1309" w:type="dxa"/>
+            <w:tcW w:w="934" w:type="dxa"/>
             <w:tcBorders>
               <w:top w:val="single" w:sz="4" w:space="0" w:color="auto"/>
             </w:tcBorders>
@@ -388,7 +529,7 @@
         </w:tc>
         <w:tc>
           <w:tcPr>
-            <w:tcW w:w="1309" w:type="dxa"/>
+            <w:tcW w:w="1041" w:type="dxa"/>
             <w:tcBorders>
               <w:top w:val="single" w:sz="4" w:space="0" w:color="auto"/>
             </w:tcBorders>
@@ -402,7 +543,7 @@
         </w:tc>
         <w:tc>
           <w:tcPr>
-            <w:tcW w:w="1309" w:type="dxa"/>
+            <w:tcW w:w="1041" w:type="dxa"/>
             <w:tcBorders>
               <w:top w:val="single" w:sz="4" w:space="0" w:color="auto"/>
             </w:tcBorders>
@@ -414,14 +555,70 @@
             </w:pPr>
           </w:p>
         </w:tc>
+        <w:tc>
+          <w:tcPr>
+            <w:tcW w:w="1041" w:type="dxa"/>
+            <w:tcBorders>
+              <w:top w:val="single" w:sz="4" w:space="0" w:color="auto"/>
+            </w:tcBorders>
+            <w:vAlign w:val="center"/>
+          </w:tcPr>
+          <w:p>
+            <w:pPr>
+              <w:jc w:val="center"/>
+            </w:pPr>
+          </w:p>
+        </w:tc>
+        <w:tc>
+          <w:tcPr>
+            <w:tcW w:w="1091" w:type="dxa"/>
+            <w:tcBorders>
+              <w:top w:val="single" w:sz="4" w:space="0" w:color="auto"/>
+            </w:tcBorders>
+            <w:vAlign w:val="center"/>
+          </w:tcPr>
+          <w:p>
+            <w:pPr>
+              <w:jc w:val="center"/>
+            </w:pPr>
+          </w:p>
+        </w:tc>
+        <w:tc>
+          <w:tcPr>
+            <w:tcW w:w="924" w:type="dxa"/>
+            <w:tcBorders>
+              <w:top w:val="single" w:sz="4" w:space="0" w:color="auto"/>
+            </w:tcBorders>
+            <w:vAlign w:val="center"/>
+          </w:tcPr>
+          <w:p>
+            <w:pPr>
+              <w:jc w:val="center"/>
+            </w:pPr>
+          </w:p>
+        </w:tc>
+        <w:tc>
+          <w:tcPr>
+            <w:tcW w:w="931" w:type="dxa"/>
+            <w:tcBorders>
+              <w:top w:val="single" w:sz="4" w:space="0" w:color="auto"/>
+            </w:tcBorders>
+            <w:vAlign w:val="center"/>
+          </w:tcPr>
+          <w:p>
+            <w:pPr>
+              <w:jc w:val="center"/>
+            </w:pPr>
+          </w:p>
+        </w:tc>
       </w:tr>
       <w:tr>
         <w:trPr>
-          <w:trHeight w:val="409"/>
+          <w:trHeight w:val="411"/>
         </w:trPr>
         <w:tc>
           <w:tcPr>
-            <w:tcW w:w="3605" w:type="dxa"/>
+            <w:tcW w:w="2590" w:type="dxa"/>
             <w:vAlign w:val="center"/>
           </w:tcPr>
           <w:p>
@@ -438,7 +635,7 @@
         </w:tc>
         <w:tc>
           <w:tcPr>
-            <w:tcW w:w="1308" w:type="dxa"/>
+            <w:tcW w:w="975" w:type="dxa"/>
             <w:vAlign w:val="center"/>
           </w:tcPr>
           <w:p>
@@ -458,7 +655,7 @@
         </w:tc>
         <w:tc>
           <w:tcPr>
-            <w:tcW w:w="1309" w:type="dxa"/>
+            <w:tcW w:w="912" w:type="dxa"/>
             <w:vAlign w:val="center"/>
           </w:tcPr>
           <w:p>
@@ -478,7 +675,7 @@
         </w:tc>
         <w:tc>
           <w:tcPr>
-            <w:tcW w:w="1309" w:type="dxa"/>
+            <w:tcW w:w="934" w:type="dxa"/>
             <w:vAlign w:val="center"/>
           </w:tcPr>
           <w:p>
@@ -498,7 +695,27 @@
         </w:tc>
         <w:tc>
           <w:tcPr>
-            <w:tcW w:w="1309" w:type="dxa"/>
+            <w:tcW w:w="1108" w:type="dxa"/>
+            <w:vAlign w:val="center"/>
+          </w:tcPr>
+          <w:p>
+            <w:pPr>
+              <w:jc w:val="center"/>
+              <w:rPr>
+                <w:bCs/>
+              </w:rPr>
+            </w:pPr>
+            <w:r>
+              <w:rPr>
+                <w:bCs/>
+              </w:rPr>
+              <w:t>2.01</w:t>
+            </w:r>
+          </w:p>
+        </w:tc>
+        <w:tc>
+          <w:tcPr>
+            <w:tcW w:w="982" w:type="dxa"/>
             <w:vAlign w:val="center"/>
           </w:tcPr>
           <w:p>
@@ -518,7 +735,7 @@
         </w:tc>
         <w:tc>
           <w:tcPr>
-            <w:tcW w:w="1308" w:type="dxa"/>
+            <w:tcW w:w="934" w:type="dxa"/>
             <w:vAlign w:val="center"/>
           </w:tcPr>
           <w:p>
@@ -538,35 +755,101 @@
         </w:tc>
         <w:tc>
           <w:tcPr>
-            <w:tcW w:w="1309" w:type="dxa"/>
-            <w:vAlign w:val="center"/>
-          </w:tcPr>
-          <w:p>
-            <w:pPr>
-              <w:jc w:val="center"/>
-              <w:rPr>
-                <w:bCs/>
-              </w:rPr>
-            </w:pPr>
-          </w:p>
-        </w:tc>
-        <w:tc>
-          <w:tcPr>
-            <w:tcW w:w="1309" w:type="dxa"/>
-            <w:vAlign w:val="center"/>
-          </w:tcPr>
-          <w:p>
-            <w:pPr>
-              <w:jc w:val="center"/>
-              <w:rPr>
-                <w:bCs/>
-              </w:rPr>
-            </w:pPr>
-          </w:p>
-        </w:tc>
-        <w:tc>
-          <w:tcPr>
-            <w:tcW w:w="1309" w:type="dxa"/>
+            <w:tcW w:w="1041" w:type="dxa"/>
+            <w:vAlign w:val="center"/>
+          </w:tcPr>
+          <w:p>
+            <w:pPr>
+              <w:jc w:val="center"/>
+              <w:rPr>
+                <w:bCs/>
+              </w:rPr>
+            </w:pPr>
+            <w:r>
+              <w:rPr>
+                <w:bCs/>
+              </w:rPr>
+              <w:t>79737.38</w:t>
+            </w:r>
+          </w:p>
+        </w:tc>
+        <w:tc>
+          <w:tcPr>
+            <w:tcW w:w="1041" w:type="dxa"/>
+            <w:vAlign w:val="center"/>
+          </w:tcPr>
+          <w:p>
+            <w:pPr>
+              <w:jc w:val="center"/>
+              <w:rPr>
+                <w:bCs/>
+              </w:rPr>
+            </w:pPr>
+            <w:r>
+              <w:rPr>
+                <w:bCs/>
+              </w:rPr>
+              <w:t>79754.7</w:t>
+            </w:r>
+            <w:r>
+              <w:rPr>
+                <w:bCs/>
+              </w:rPr>
+              <w:t>3</w:t>
+            </w:r>
+          </w:p>
+        </w:tc>
+        <w:tc>
+          <w:tcPr>
+            <w:tcW w:w="1041" w:type="dxa"/>
+            <w:vAlign w:val="center"/>
+          </w:tcPr>
+          <w:p>
+            <w:pPr>
+              <w:jc w:val="center"/>
+              <w:rPr>
+                <w:bCs/>
+              </w:rPr>
+            </w:pPr>
+            <w:r>
+              <w:rPr>
+                <w:bCs/>
+              </w:rPr>
+              <w:t>79745.19</w:t>
+            </w:r>
+          </w:p>
+        </w:tc>
+        <w:tc>
+          <w:tcPr>
+            <w:tcW w:w="1091" w:type="dxa"/>
+            <w:vAlign w:val="center"/>
+          </w:tcPr>
+          <w:p>
+            <w:pPr>
+              <w:jc w:val="center"/>
+              <w:rPr>
+                <w:bCs/>
+              </w:rPr>
+            </w:pPr>
+          </w:p>
+        </w:tc>
+        <w:tc>
+          <w:tcPr>
+            <w:tcW w:w="924" w:type="dxa"/>
+            <w:vAlign w:val="center"/>
+          </w:tcPr>
+          <w:p>
+            <w:pPr>
+              <w:jc w:val="center"/>
+              <w:rPr>
+                <w:bCs/>
+              </w:rPr>
+            </w:pPr>
+          </w:p>
+        </w:tc>
+        <w:tc>
+          <w:tcPr>
+            <w:tcW w:w="931" w:type="dxa"/>
             <w:vAlign w:val="center"/>
           </w:tcPr>
           <w:p>
@@ -581,11 +864,11 @@
       </w:tr>
       <w:tr>
         <w:trPr>
-          <w:trHeight w:val="409"/>
+          <w:trHeight w:val="411"/>
         </w:trPr>
         <w:tc>
           <w:tcPr>
-            <w:tcW w:w="3605" w:type="dxa"/>
+            <w:tcW w:w="2590" w:type="dxa"/>
             <w:vAlign w:val="center"/>
           </w:tcPr>
           <w:p>
@@ -602,7 +885,7 @@
         </w:tc>
         <w:tc>
           <w:tcPr>
-            <w:tcW w:w="1308" w:type="dxa"/>
+            <w:tcW w:w="975" w:type="dxa"/>
             <w:vAlign w:val="center"/>
           </w:tcPr>
           <w:p>
@@ -622,7 +905,7 @@
         </w:tc>
         <w:tc>
           <w:tcPr>
-            <w:tcW w:w="1309" w:type="dxa"/>
+            <w:tcW w:w="912" w:type="dxa"/>
             <w:vAlign w:val="center"/>
           </w:tcPr>
           <w:p>
@@ -642,7 +925,7 @@
         </w:tc>
         <w:tc>
           <w:tcPr>
-            <w:tcW w:w="1309" w:type="dxa"/>
+            <w:tcW w:w="934" w:type="dxa"/>
             <w:vAlign w:val="center"/>
           </w:tcPr>
           <w:p>
@@ -662,7 +945,33 @@
         </w:tc>
         <w:tc>
           <w:tcPr>
-            <w:tcW w:w="1309" w:type="dxa"/>
+            <w:tcW w:w="1108" w:type="dxa"/>
+            <w:vAlign w:val="center"/>
+          </w:tcPr>
+          <w:p>
+            <w:pPr>
+              <w:jc w:val="center"/>
+              <w:rPr>
+                <w:bCs/>
+              </w:rPr>
+            </w:pPr>
+            <w:r>
+              <w:rPr>
+                <w:bCs/>
+              </w:rPr>
+              <w:t>1.9</w:t>
+            </w:r>
+            <w:r>
+              <w:rPr>
+                <w:bCs/>
+              </w:rPr>
+              <w:t>6</w:t>
+            </w:r>
+          </w:p>
+        </w:tc>
+        <w:tc>
+          <w:tcPr>
+            <w:tcW w:w="982" w:type="dxa"/>
             <w:vAlign w:val="center"/>
           </w:tcPr>
           <w:p>
@@ -682,7 +991,7 @@
         </w:tc>
         <w:tc>
           <w:tcPr>
-            <w:tcW w:w="1308" w:type="dxa"/>
+            <w:tcW w:w="934" w:type="dxa"/>
             <w:vAlign w:val="center"/>
           </w:tcPr>
           <w:p>
@@ -702,35 +1011,107 @@
         </w:tc>
         <w:tc>
           <w:tcPr>
-            <w:tcW w:w="1309" w:type="dxa"/>
-            <w:vAlign w:val="center"/>
-          </w:tcPr>
-          <w:p>
-            <w:pPr>
-              <w:jc w:val="center"/>
-              <w:rPr>
-                <w:bCs/>
-              </w:rPr>
-            </w:pPr>
-          </w:p>
-        </w:tc>
-        <w:tc>
-          <w:tcPr>
-            <w:tcW w:w="1309" w:type="dxa"/>
-            <w:vAlign w:val="center"/>
-          </w:tcPr>
-          <w:p>
-            <w:pPr>
-              <w:jc w:val="center"/>
-              <w:rPr>
-                <w:bCs/>
-              </w:rPr>
-            </w:pPr>
-          </w:p>
-        </w:tc>
-        <w:tc>
-          <w:tcPr>
-            <w:tcW w:w="1309" w:type="dxa"/>
+            <w:tcW w:w="1041" w:type="dxa"/>
+            <w:vAlign w:val="center"/>
+          </w:tcPr>
+          <w:p>
+            <w:pPr>
+              <w:jc w:val="center"/>
+              <w:rPr>
+                <w:bCs/>
+              </w:rPr>
+            </w:pPr>
+            <w:r>
+              <w:rPr>
+                <w:bCs/>
+              </w:rPr>
+              <w:t>70747.0</w:t>
+            </w:r>
+            <w:r>
+              <w:rPr>
+                <w:bCs/>
+              </w:rPr>
+              <w:t>8</w:t>
+            </w:r>
+          </w:p>
+        </w:tc>
+        <w:tc>
+          <w:tcPr>
+            <w:tcW w:w="1041" w:type="dxa"/>
+            <w:vAlign w:val="center"/>
+          </w:tcPr>
+          <w:p>
+            <w:pPr>
+              <w:jc w:val="center"/>
+              <w:rPr>
+                <w:bCs/>
+              </w:rPr>
+            </w:pPr>
+            <w:r>
+              <w:rPr>
+                <w:bCs/>
+              </w:rPr>
+              <w:t>70781.7</w:t>
+            </w:r>
+            <w:r>
+              <w:rPr>
+                <w:bCs/>
+              </w:rPr>
+              <w:t>7</w:t>
+            </w:r>
+          </w:p>
+        </w:tc>
+        <w:tc>
+          <w:tcPr>
+            <w:tcW w:w="1041" w:type="dxa"/>
+            <w:vAlign w:val="center"/>
+          </w:tcPr>
+          <w:p>
+            <w:pPr>
+              <w:jc w:val="center"/>
+              <w:rPr>
+                <w:bCs/>
+              </w:rPr>
+            </w:pPr>
+            <w:r>
+              <w:rPr>
+                <w:bCs/>
+              </w:rPr>
+              <w:t>70762.70</w:t>
+            </w:r>
+          </w:p>
+        </w:tc>
+        <w:tc>
+          <w:tcPr>
+            <w:tcW w:w="1091" w:type="dxa"/>
+            <w:vAlign w:val="center"/>
+          </w:tcPr>
+          <w:p>
+            <w:pPr>
+              <w:jc w:val="center"/>
+              <w:rPr>
+                <w:bCs/>
+              </w:rPr>
+            </w:pPr>
+          </w:p>
+        </w:tc>
+        <w:tc>
+          <w:tcPr>
+            <w:tcW w:w="924" w:type="dxa"/>
+            <w:vAlign w:val="center"/>
+          </w:tcPr>
+          <w:p>
+            <w:pPr>
+              <w:jc w:val="center"/>
+              <w:rPr>
+                <w:bCs/>
+              </w:rPr>
+            </w:pPr>
+          </w:p>
+        </w:tc>
+        <w:tc>
+          <w:tcPr>
+            <w:tcW w:w="931" w:type="dxa"/>
             <w:vAlign w:val="center"/>
           </w:tcPr>
           <w:p>
@@ -745,11 +1126,11 @@
       </w:tr>
       <w:tr>
         <w:trPr>
-          <w:trHeight w:val="425"/>
+          <w:trHeight w:val="427"/>
         </w:trPr>
         <w:tc>
           <w:tcPr>
-            <w:tcW w:w="3605" w:type="dxa"/>
+            <w:tcW w:w="2590" w:type="dxa"/>
             <w:vAlign w:val="center"/>
           </w:tcPr>
           <w:p>
@@ -760,16 +1141,13 @@
               </w:numPr>
             </w:pPr>
             <w:r>
-              <w:t>Quadratic growth model</w:t>
-            </w:r>
-            <w:r>
-              <w:t>*</w:t>
-            </w:r>
-          </w:p>
-        </w:tc>
-        <w:tc>
-          <w:tcPr>
-            <w:tcW w:w="1308" w:type="dxa"/>
+              <w:t>Quadratic growth model*</w:t>
+            </w:r>
+          </w:p>
+        </w:tc>
+        <w:tc>
+          <w:tcPr>
+            <w:tcW w:w="975" w:type="dxa"/>
             <w:vAlign w:val="center"/>
           </w:tcPr>
           <w:p>
@@ -789,7 +1167,7 @@
         </w:tc>
         <w:tc>
           <w:tcPr>
-            <w:tcW w:w="1309" w:type="dxa"/>
+            <w:tcW w:w="912" w:type="dxa"/>
             <w:vAlign w:val="center"/>
           </w:tcPr>
           <w:p>
@@ -809,7 +1187,7 @@
         </w:tc>
         <w:tc>
           <w:tcPr>
-            <w:tcW w:w="1309" w:type="dxa"/>
+            <w:tcW w:w="934" w:type="dxa"/>
             <w:vAlign w:val="center"/>
           </w:tcPr>
           <w:p>
@@ -829,7 +1207,27 @@
         </w:tc>
         <w:tc>
           <w:tcPr>
-            <w:tcW w:w="1309" w:type="dxa"/>
+            <w:tcW w:w="1108" w:type="dxa"/>
+            <w:vAlign w:val="center"/>
+          </w:tcPr>
+          <w:p>
+            <w:pPr>
+              <w:jc w:val="center"/>
+              <w:rPr>
+                <w:bCs/>
+              </w:rPr>
+            </w:pPr>
+            <w:r>
+              <w:rPr>
+                <w:bCs/>
+              </w:rPr>
+              <w:t>2.00</w:t>
+            </w:r>
+          </w:p>
+        </w:tc>
+        <w:tc>
+          <w:tcPr>
+            <w:tcW w:w="982" w:type="dxa"/>
             <w:vAlign w:val="center"/>
           </w:tcPr>
           <w:p>
@@ -849,7 +1247,7 @@
         </w:tc>
         <w:tc>
           <w:tcPr>
-            <w:tcW w:w="1308" w:type="dxa"/>
+            <w:tcW w:w="934" w:type="dxa"/>
             <w:vAlign w:val="center"/>
           </w:tcPr>
           <w:p>
@@ -869,35 +1267,95 @@
         </w:tc>
         <w:tc>
           <w:tcPr>
-            <w:tcW w:w="1309" w:type="dxa"/>
-            <w:vAlign w:val="center"/>
-          </w:tcPr>
-          <w:p>
-            <w:pPr>
-              <w:jc w:val="center"/>
-              <w:rPr>
-                <w:bCs/>
-              </w:rPr>
-            </w:pPr>
-          </w:p>
-        </w:tc>
-        <w:tc>
-          <w:tcPr>
-            <w:tcW w:w="1309" w:type="dxa"/>
-            <w:vAlign w:val="center"/>
-          </w:tcPr>
-          <w:p>
-            <w:pPr>
-              <w:jc w:val="center"/>
-              <w:rPr>
-                <w:bCs/>
-              </w:rPr>
-            </w:pPr>
-          </w:p>
-        </w:tc>
-        <w:tc>
-          <w:tcPr>
-            <w:tcW w:w="1309" w:type="dxa"/>
+            <w:tcW w:w="1041" w:type="dxa"/>
+            <w:vAlign w:val="center"/>
+          </w:tcPr>
+          <w:p>
+            <w:pPr>
+              <w:jc w:val="center"/>
+              <w:rPr>
+                <w:bCs/>
+              </w:rPr>
+            </w:pPr>
+            <w:r>
+              <w:rPr>
+                <w:bCs/>
+              </w:rPr>
+              <w:t>70556.23</w:t>
+            </w:r>
+          </w:p>
+        </w:tc>
+        <w:tc>
+          <w:tcPr>
+            <w:tcW w:w="1041" w:type="dxa"/>
+            <w:vAlign w:val="center"/>
+          </w:tcPr>
+          <w:p>
+            <w:pPr>
+              <w:jc w:val="center"/>
+              <w:rPr>
+                <w:bCs/>
+              </w:rPr>
+            </w:pPr>
+            <w:r>
+              <w:rPr>
+                <w:bCs/>
+              </w:rPr>
+              <w:t>70596.70</w:t>
+            </w:r>
+          </w:p>
+        </w:tc>
+        <w:tc>
+          <w:tcPr>
+            <w:tcW w:w="1041" w:type="dxa"/>
+            <w:vAlign w:val="center"/>
+          </w:tcPr>
+          <w:p>
+            <w:pPr>
+              <w:jc w:val="center"/>
+              <w:rPr>
+                <w:bCs/>
+              </w:rPr>
+            </w:pPr>
+            <w:r>
+              <w:rPr>
+                <w:bCs/>
+              </w:rPr>
+              <w:t>70574.46</w:t>
+            </w:r>
+          </w:p>
+        </w:tc>
+        <w:tc>
+          <w:tcPr>
+            <w:tcW w:w="1091" w:type="dxa"/>
+            <w:vAlign w:val="center"/>
+          </w:tcPr>
+          <w:p>
+            <w:pPr>
+              <w:jc w:val="center"/>
+              <w:rPr>
+                <w:bCs/>
+              </w:rPr>
+            </w:pPr>
+          </w:p>
+        </w:tc>
+        <w:tc>
+          <w:tcPr>
+            <w:tcW w:w="924" w:type="dxa"/>
+            <w:vAlign w:val="center"/>
+          </w:tcPr>
+          <w:p>
+            <w:pPr>
+              <w:jc w:val="center"/>
+              <w:rPr>
+                <w:bCs/>
+              </w:rPr>
+            </w:pPr>
+          </w:p>
+        </w:tc>
+        <w:tc>
+          <w:tcPr>
+            <w:tcW w:w="931" w:type="dxa"/>
             <w:vAlign w:val="center"/>
           </w:tcPr>
           <w:p>
@@ -912,11 +1370,11 @@
       </w:tr>
       <w:tr>
         <w:trPr>
-          <w:trHeight w:val="425"/>
+          <w:trHeight w:val="427"/>
         </w:trPr>
         <w:tc>
           <w:tcPr>
-            <w:tcW w:w="3605" w:type="dxa"/>
+            <w:tcW w:w="2590" w:type="dxa"/>
             <w:vAlign w:val="center"/>
           </w:tcPr>
           <w:p>
@@ -933,19 +1391,19 @@
         </w:tc>
         <w:tc>
           <w:tcPr>
-            <w:tcW w:w="1308" w:type="dxa"/>
-            <w:vAlign w:val="center"/>
-          </w:tcPr>
-          <w:p>
-            <w:pPr>
-              <w:jc w:val="center"/>
-              <w:rPr>
-                <w:bCs/>
-              </w:rPr>
-            </w:pPr>
-            <w:r>
-              <w:rPr>
-                <w:bCs/>
+            <w:tcW w:w="975" w:type="dxa"/>
+            <w:vAlign w:val="center"/>
+          </w:tcPr>
+          <w:p>
+            <w:pPr>
+              <w:jc w:val="center"/>
+              <w:rPr>
+                <w:b/>
+              </w:rPr>
+            </w:pPr>
+            <w:r>
+              <w:rPr>
+                <w:b/>
               </w:rPr>
               <w:t>79.76</w:t>
             </w:r>
@@ -953,19 +1411,19 @@
         </w:tc>
         <w:tc>
           <w:tcPr>
-            <w:tcW w:w="1309" w:type="dxa"/>
-            <w:vAlign w:val="center"/>
-          </w:tcPr>
-          <w:p>
-            <w:pPr>
-              <w:jc w:val="center"/>
-              <w:rPr>
-                <w:bCs/>
-              </w:rPr>
-            </w:pPr>
-            <w:r>
-              <w:rPr>
-                <w:bCs/>
+            <w:tcW w:w="912" w:type="dxa"/>
+            <w:vAlign w:val="center"/>
+          </w:tcPr>
+          <w:p>
+            <w:pPr>
+              <w:jc w:val="center"/>
+              <w:rPr>
+                <w:b/>
+              </w:rPr>
+            </w:pPr>
+            <w:r>
+              <w:rPr>
+                <w:b/>
               </w:rPr>
               <w:t>6</w:t>
             </w:r>
@@ -973,19 +1431,19 @@
         </w:tc>
         <w:tc>
           <w:tcPr>
-            <w:tcW w:w="1309" w:type="dxa"/>
-            <w:vAlign w:val="center"/>
-          </w:tcPr>
-          <w:p>
-            <w:pPr>
-              <w:jc w:val="center"/>
-              <w:rPr>
-                <w:bCs/>
-              </w:rPr>
-            </w:pPr>
-            <w:r>
-              <w:rPr>
-                <w:bCs/>
+            <w:tcW w:w="934" w:type="dxa"/>
+            <w:vAlign w:val="center"/>
+          </w:tcPr>
+          <w:p>
+            <w:pPr>
+              <w:jc w:val="center"/>
+              <w:rPr>
+                <w:b/>
+              </w:rPr>
+            </w:pPr>
+            <w:r>
+              <w:rPr>
+                <w:b/>
               </w:rPr>
               <w:t>&lt; .001</w:t>
             </w:r>
@@ -993,19 +1451,39 @@
         </w:tc>
         <w:tc>
           <w:tcPr>
-            <w:tcW w:w="1309" w:type="dxa"/>
-            <w:vAlign w:val="center"/>
-          </w:tcPr>
-          <w:p>
-            <w:pPr>
-              <w:jc w:val="center"/>
-              <w:rPr>
-                <w:bCs/>
-              </w:rPr>
-            </w:pPr>
-            <w:r>
-              <w:rPr>
-                <w:bCs/>
+            <w:tcW w:w="1108" w:type="dxa"/>
+            <w:vAlign w:val="center"/>
+          </w:tcPr>
+          <w:p>
+            <w:pPr>
+              <w:jc w:val="center"/>
+              <w:rPr>
+                <w:b/>
+              </w:rPr>
+            </w:pPr>
+            <w:r>
+              <w:rPr>
+                <w:b/>
+              </w:rPr>
+              <w:t>1.95</w:t>
+            </w:r>
+          </w:p>
+        </w:tc>
+        <w:tc>
+          <w:tcPr>
+            <w:tcW w:w="982" w:type="dxa"/>
+            <w:vAlign w:val="center"/>
+          </w:tcPr>
+          <w:p>
+            <w:pPr>
+              <w:jc w:val="center"/>
+              <w:rPr>
+                <w:b/>
+              </w:rPr>
+            </w:pPr>
+            <w:r>
+              <w:rPr>
+                <w:b/>
               </w:rPr>
               <w:t>0.07</w:t>
             </w:r>
@@ -1013,19 +1491,19 @@
         </w:tc>
         <w:tc>
           <w:tcPr>
-            <w:tcW w:w="1308" w:type="dxa"/>
-            <w:vAlign w:val="center"/>
-          </w:tcPr>
-          <w:p>
-            <w:pPr>
-              <w:jc w:val="center"/>
-              <w:rPr>
-                <w:bCs/>
-              </w:rPr>
-            </w:pPr>
-            <w:r>
-              <w:rPr>
-                <w:bCs/>
+            <w:tcW w:w="934" w:type="dxa"/>
+            <w:vAlign w:val="center"/>
+          </w:tcPr>
+          <w:p>
+            <w:pPr>
+              <w:jc w:val="center"/>
+              <w:rPr>
+                <w:b/>
+              </w:rPr>
+            </w:pPr>
+            <w:r>
+              <w:rPr>
+                <w:b/>
               </w:rPr>
               <w:t>0.99</w:t>
             </w:r>
@@ -1033,35 +1511,95 @@
         </w:tc>
         <w:tc>
           <w:tcPr>
-            <w:tcW w:w="1309" w:type="dxa"/>
-            <w:vAlign w:val="center"/>
-          </w:tcPr>
-          <w:p>
-            <w:pPr>
-              <w:jc w:val="center"/>
-              <w:rPr>
-                <w:bCs/>
-              </w:rPr>
-            </w:pPr>
-          </w:p>
-        </w:tc>
-        <w:tc>
-          <w:tcPr>
-            <w:tcW w:w="1309" w:type="dxa"/>
-            <w:vAlign w:val="center"/>
-          </w:tcPr>
-          <w:p>
-            <w:pPr>
-              <w:jc w:val="center"/>
-              <w:rPr>
-                <w:bCs/>
-              </w:rPr>
-            </w:pPr>
-          </w:p>
-        </w:tc>
-        <w:tc>
-          <w:tcPr>
-            <w:tcW w:w="1309" w:type="dxa"/>
+            <w:tcW w:w="1041" w:type="dxa"/>
+            <w:vAlign w:val="center"/>
+          </w:tcPr>
+          <w:p>
+            <w:pPr>
+              <w:jc w:val="center"/>
+              <w:rPr>
+                <w:b/>
+              </w:rPr>
+            </w:pPr>
+            <w:r>
+              <w:rPr>
+                <w:b/>
+              </w:rPr>
+              <w:t>70227.85</w:t>
+            </w:r>
+          </w:p>
+        </w:tc>
+        <w:tc>
+          <w:tcPr>
+            <w:tcW w:w="1041" w:type="dxa"/>
+            <w:vAlign w:val="center"/>
+          </w:tcPr>
+          <w:p>
+            <w:pPr>
+              <w:jc w:val="center"/>
+              <w:rPr>
+                <w:b/>
+              </w:rPr>
+            </w:pPr>
+            <w:r>
+              <w:rPr>
+                <w:b/>
+              </w:rPr>
+              <w:t>70274.11</w:t>
+            </w:r>
+          </w:p>
+        </w:tc>
+        <w:tc>
+          <w:tcPr>
+            <w:tcW w:w="1041" w:type="dxa"/>
+            <w:vAlign w:val="center"/>
+          </w:tcPr>
+          <w:p>
+            <w:pPr>
+              <w:jc w:val="center"/>
+              <w:rPr>
+                <w:b/>
+              </w:rPr>
+            </w:pPr>
+            <w:r>
+              <w:rPr>
+                <w:b/>
+              </w:rPr>
+              <w:t>70248.69</w:t>
+            </w:r>
+          </w:p>
+        </w:tc>
+        <w:tc>
+          <w:tcPr>
+            <w:tcW w:w="1091" w:type="dxa"/>
+            <w:vAlign w:val="center"/>
+          </w:tcPr>
+          <w:p>
+            <w:pPr>
+              <w:jc w:val="center"/>
+              <w:rPr>
+                <w:bCs/>
+              </w:rPr>
+            </w:pPr>
+          </w:p>
+        </w:tc>
+        <w:tc>
+          <w:tcPr>
+            <w:tcW w:w="924" w:type="dxa"/>
+            <w:vAlign w:val="center"/>
+          </w:tcPr>
+          <w:p>
+            <w:pPr>
+              <w:jc w:val="center"/>
+              <w:rPr>
+                <w:bCs/>
+              </w:rPr>
+            </w:pPr>
+          </w:p>
+        </w:tc>
+        <w:tc>
+          <w:tcPr>
+            <w:tcW w:w="931" w:type="dxa"/>
             <w:vAlign w:val="center"/>
           </w:tcPr>
           <w:p>
@@ -1076,11 +1614,11 @@
       </w:tr>
       <w:tr>
         <w:trPr>
-          <w:trHeight w:val="425"/>
+          <w:trHeight w:val="297"/>
         </w:trPr>
         <w:tc>
           <w:tcPr>
-            <w:tcW w:w="3605" w:type="dxa"/>
+            <w:tcW w:w="2590" w:type="dxa"/>
             <w:vAlign w:val="center"/>
           </w:tcPr>
           <w:p>
@@ -1094,105 +1632,161 @@
         </w:tc>
         <w:tc>
           <w:tcPr>
-            <w:tcW w:w="1308" w:type="dxa"/>
-            <w:vAlign w:val="center"/>
-          </w:tcPr>
-          <w:p>
-            <w:pPr>
-              <w:jc w:val="center"/>
-              <w:rPr>
-                <w:bCs/>
-              </w:rPr>
-            </w:pPr>
-          </w:p>
-        </w:tc>
-        <w:tc>
-          <w:tcPr>
-            <w:tcW w:w="1309" w:type="dxa"/>
-            <w:vAlign w:val="center"/>
-          </w:tcPr>
-          <w:p>
-            <w:pPr>
-              <w:jc w:val="center"/>
-              <w:rPr>
-                <w:bCs/>
-              </w:rPr>
-            </w:pPr>
-          </w:p>
-        </w:tc>
-        <w:tc>
-          <w:tcPr>
-            <w:tcW w:w="1309" w:type="dxa"/>
-            <w:vAlign w:val="center"/>
-          </w:tcPr>
-          <w:p>
-            <w:pPr>
-              <w:jc w:val="center"/>
-              <w:rPr>
-                <w:bCs/>
-              </w:rPr>
-            </w:pPr>
-          </w:p>
-        </w:tc>
-        <w:tc>
-          <w:tcPr>
-            <w:tcW w:w="1309" w:type="dxa"/>
-            <w:vAlign w:val="center"/>
-          </w:tcPr>
-          <w:p>
-            <w:pPr>
-              <w:jc w:val="center"/>
-              <w:rPr>
-                <w:bCs/>
-              </w:rPr>
-            </w:pPr>
-          </w:p>
-        </w:tc>
-        <w:tc>
-          <w:tcPr>
-            <w:tcW w:w="1308" w:type="dxa"/>
-            <w:vAlign w:val="center"/>
-          </w:tcPr>
-          <w:p>
-            <w:pPr>
-              <w:jc w:val="center"/>
-              <w:rPr>
-                <w:bCs/>
-              </w:rPr>
-            </w:pPr>
-          </w:p>
-        </w:tc>
-        <w:tc>
-          <w:tcPr>
-            <w:tcW w:w="1309" w:type="dxa"/>
-            <w:vAlign w:val="center"/>
-          </w:tcPr>
-          <w:p>
-            <w:pPr>
-              <w:jc w:val="center"/>
-              <w:rPr>
-                <w:bCs/>
-              </w:rPr>
-            </w:pPr>
-          </w:p>
-        </w:tc>
-        <w:tc>
-          <w:tcPr>
-            <w:tcW w:w="1309" w:type="dxa"/>
-            <w:vAlign w:val="center"/>
-          </w:tcPr>
-          <w:p>
-            <w:pPr>
-              <w:jc w:val="center"/>
-              <w:rPr>
-                <w:bCs/>
-              </w:rPr>
-            </w:pPr>
-          </w:p>
-        </w:tc>
-        <w:tc>
-          <w:tcPr>
-            <w:tcW w:w="1309" w:type="dxa"/>
+            <w:tcW w:w="975" w:type="dxa"/>
+            <w:vAlign w:val="center"/>
+          </w:tcPr>
+          <w:p>
+            <w:pPr>
+              <w:jc w:val="center"/>
+              <w:rPr>
+                <w:bCs/>
+              </w:rPr>
+            </w:pPr>
+          </w:p>
+        </w:tc>
+        <w:tc>
+          <w:tcPr>
+            <w:tcW w:w="912" w:type="dxa"/>
+            <w:vAlign w:val="center"/>
+          </w:tcPr>
+          <w:p>
+            <w:pPr>
+              <w:jc w:val="center"/>
+              <w:rPr>
+                <w:bCs/>
+              </w:rPr>
+            </w:pPr>
+          </w:p>
+        </w:tc>
+        <w:tc>
+          <w:tcPr>
+            <w:tcW w:w="934" w:type="dxa"/>
+            <w:vAlign w:val="center"/>
+          </w:tcPr>
+          <w:p>
+            <w:pPr>
+              <w:jc w:val="center"/>
+              <w:rPr>
+                <w:bCs/>
+              </w:rPr>
+            </w:pPr>
+          </w:p>
+        </w:tc>
+        <w:tc>
+          <w:tcPr>
+            <w:tcW w:w="1108" w:type="dxa"/>
+            <w:vAlign w:val="center"/>
+          </w:tcPr>
+          <w:p>
+            <w:pPr>
+              <w:jc w:val="center"/>
+              <w:rPr>
+                <w:bCs/>
+              </w:rPr>
+            </w:pPr>
+          </w:p>
+        </w:tc>
+        <w:tc>
+          <w:tcPr>
+            <w:tcW w:w="982" w:type="dxa"/>
+            <w:vAlign w:val="center"/>
+          </w:tcPr>
+          <w:p>
+            <w:pPr>
+              <w:jc w:val="center"/>
+              <w:rPr>
+                <w:bCs/>
+              </w:rPr>
+            </w:pPr>
+          </w:p>
+        </w:tc>
+        <w:tc>
+          <w:tcPr>
+            <w:tcW w:w="934" w:type="dxa"/>
+            <w:vAlign w:val="center"/>
+          </w:tcPr>
+          <w:p>
+            <w:pPr>
+              <w:jc w:val="center"/>
+              <w:rPr>
+                <w:bCs/>
+              </w:rPr>
+            </w:pPr>
+          </w:p>
+        </w:tc>
+        <w:tc>
+          <w:tcPr>
+            <w:tcW w:w="1041" w:type="dxa"/>
+            <w:vAlign w:val="center"/>
+          </w:tcPr>
+          <w:p>
+            <w:pPr>
+              <w:jc w:val="center"/>
+              <w:rPr>
+                <w:bCs/>
+              </w:rPr>
+            </w:pPr>
+          </w:p>
+        </w:tc>
+        <w:tc>
+          <w:tcPr>
+            <w:tcW w:w="1041" w:type="dxa"/>
+            <w:vAlign w:val="center"/>
+          </w:tcPr>
+          <w:p>
+            <w:pPr>
+              <w:jc w:val="center"/>
+              <w:rPr>
+                <w:bCs/>
+              </w:rPr>
+            </w:pPr>
+          </w:p>
+        </w:tc>
+        <w:tc>
+          <w:tcPr>
+            <w:tcW w:w="1041" w:type="dxa"/>
+            <w:vAlign w:val="center"/>
+          </w:tcPr>
+          <w:p>
+            <w:pPr>
+              <w:jc w:val="center"/>
+              <w:rPr>
+                <w:bCs/>
+              </w:rPr>
+            </w:pPr>
+          </w:p>
+        </w:tc>
+        <w:tc>
+          <w:tcPr>
+            <w:tcW w:w="1091" w:type="dxa"/>
+            <w:vAlign w:val="center"/>
+          </w:tcPr>
+          <w:p>
+            <w:pPr>
+              <w:jc w:val="center"/>
+              <w:rPr>
+                <w:bCs/>
+              </w:rPr>
+            </w:pPr>
+          </w:p>
+        </w:tc>
+        <w:tc>
+          <w:tcPr>
+            <w:tcW w:w="924" w:type="dxa"/>
+            <w:vAlign w:val="center"/>
+          </w:tcPr>
+          <w:p>
+            <w:pPr>
+              <w:jc w:val="center"/>
+              <w:rPr>
+                <w:bCs/>
+              </w:rPr>
+            </w:pPr>
+          </w:p>
+        </w:tc>
+        <w:tc>
+          <w:tcPr>
+            <w:tcW w:w="931" w:type="dxa"/>
             <w:vAlign w:val="center"/>
           </w:tcPr>
           <w:p>
@@ -1207,11 +1801,11 @@
       </w:tr>
       <w:tr>
         <w:trPr>
-          <w:trHeight w:val="425"/>
+          <w:trHeight w:val="427"/>
         </w:trPr>
         <w:tc>
           <w:tcPr>
-            <w:tcW w:w="3605" w:type="dxa"/>
+            <w:tcW w:w="2590" w:type="dxa"/>
             <w:vAlign w:val="center"/>
           </w:tcPr>
           <w:p>
@@ -1228,7 +1822,7 @@
         </w:tc>
         <w:tc>
           <w:tcPr>
-            <w:tcW w:w="1308" w:type="dxa"/>
+            <w:tcW w:w="975" w:type="dxa"/>
             <w:vAlign w:val="center"/>
           </w:tcPr>
           <w:p>
@@ -1248,7 +1842,7 @@
         </w:tc>
         <w:tc>
           <w:tcPr>
-            <w:tcW w:w="1309" w:type="dxa"/>
+            <w:tcW w:w="912" w:type="dxa"/>
             <w:vAlign w:val="center"/>
           </w:tcPr>
           <w:p>
@@ -1268,7 +1862,7 @@
         </w:tc>
         <w:tc>
           <w:tcPr>
-            <w:tcW w:w="1309" w:type="dxa"/>
+            <w:tcW w:w="934" w:type="dxa"/>
             <w:vAlign w:val="center"/>
           </w:tcPr>
           <w:p>
@@ -1288,7 +1882,27 @@
         </w:tc>
         <w:tc>
           <w:tcPr>
-            <w:tcW w:w="1309" w:type="dxa"/>
+            <w:tcW w:w="1108" w:type="dxa"/>
+            <w:vAlign w:val="center"/>
+          </w:tcPr>
+          <w:p>
+            <w:pPr>
+              <w:jc w:val="center"/>
+              <w:rPr>
+                <w:bCs/>
+              </w:rPr>
+            </w:pPr>
+            <w:r>
+              <w:rPr>
+                <w:bCs/>
+              </w:rPr>
+              <w:t>2.27</w:t>
+            </w:r>
+          </w:p>
+        </w:tc>
+        <w:tc>
+          <w:tcPr>
+            <w:tcW w:w="982" w:type="dxa"/>
             <w:vAlign w:val="center"/>
           </w:tcPr>
           <w:p>
@@ -1308,7 +1922,7 @@
         </w:tc>
         <w:tc>
           <w:tcPr>
-            <w:tcW w:w="1308" w:type="dxa"/>
+            <w:tcW w:w="934" w:type="dxa"/>
             <w:vAlign w:val="center"/>
           </w:tcPr>
           <w:p>
@@ -1328,35 +1942,95 @@
         </w:tc>
         <w:tc>
           <w:tcPr>
-            <w:tcW w:w="1309" w:type="dxa"/>
-            <w:vAlign w:val="center"/>
-          </w:tcPr>
-          <w:p>
-            <w:pPr>
-              <w:jc w:val="center"/>
-              <w:rPr>
-                <w:bCs/>
-              </w:rPr>
-            </w:pPr>
-          </w:p>
-        </w:tc>
-        <w:tc>
-          <w:tcPr>
-            <w:tcW w:w="1309" w:type="dxa"/>
-            <w:vAlign w:val="center"/>
-          </w:tcPr>
-          <w:p>
-            <w:pPr>
-              <w:jc w:val="center"/>
-              <w:rPr>
-                <w:bCs/>
-              </w:rPr>
-            </w:pPr>
-          </w:p>
-        </w:tc>
-        <w:tc>
-          <w:tcPr>
-            <w:tcW w:w="1309" w:type="dxa"/>
+            <w:tcW w:w="1041" w:type="dxa"/>
+            <w:vAlign w:val="center"/>
+          </w:tcPr>
+          <w:p>
+            <w:pPr>
+              <w:jc w:val="center"/>
+              <w:rPr>
+                <w:bCs/>
+              </w:rPr>
+            </w:pPr>
+            <w:r>
+              <w:rPr>
+                <w:bCs/>
+              </w:rPr>
+              <w:t>86386.82</w:t>
+            </w:r>
+          </w:p>
+        </w:tc>
+        <w:tc>
+          <w:tcPr>
+            <w:tcW w:w="1041" w:type="dxa"/>
+            <w:vAlign w:val="center"/>
+          </w:tcPr>
+          <w:p>
+            <w:pPr>
+              <w:jc w:val="center"/>
+              <w:rPr>
+                <w:bCs/>
+              </w:rPr>
+            </w:pPr>
+            <w:r>
+              <w:rPr>
+                <w:bCs/>
+              </w:rPr>
+              <w:t>86404.46</w:t>
+            </w:r>
+          </w:p>
+        </w:tc>
+        <w:tc>
+          <w:tcPr>
+            <w:tcW w:w="1041" w:type="dxa"/>
+            <w:vAlign w:val="center"/>
+          </w:tcPr>
+          <w:p>
+            <w:pPr>
+              <w:jc w:val="center"/>
+              <w:rPr>
+                <w:bCs/>
+              </w:rPr>
+            </w:pPr>
+            <w:r>
+              <w:rPr>
+                <w:bCs/>
+              </w:rPr>
+              <w:t>86394.93</w:t>
+            </w:r>
+          </w:p>
+        </w:tc>
+        <w:tc>
+          <w:tcPr>
+            <w:tcW w:w="1091" w:type="dxa"/>
+            <w:vAlign w:val="center"/>
+          </w:tcPr>
+          <w:p>
+            <w:pPr>
+              <w:jc w:val="center"/>
+              <w:rPr>
+                <w:bCs/>
+              </w:rPr>
+            </w:pPr>
+          </w:p>
+        </w:tc>
+        <w:tc>
+          <w:tcPr>
+            <w:tcW w:w="924" w:type="dxa"/>
+            <w:vAlign w:val="center"/>
+          </w:tcPr>
+          <w:p>
+            <w:pPr>
+              <w:jc w:val="center"/>
+              <w:rPr>
+                <w:bCs/>
+              </w:rPr>
+            </w:pPr>
+          </w:p>
+        </w:tc>
+        <w:tc>
+          <w:tcPr>
+            <w:tcW w:w="931" w:type="dxa"/>
             <w:vAlign w:val="center"/>
           </w:tcPr>
           <w:p>
@@ -1371,11 +2045,11 @@
       </w:tr>
       <w:tr>
         <w:trPr>
-          <w:trHeight w:val="425"/>
+          <w:trHeight w:val="427"/>
         </w:trPr>
         <w:tc>
           <w:tcPr>
-            <w:tcW w:w="3605" w:type="dxa"/>
+            <w:tcW w:w="2590" w:type="dxa"/>
             <w:vAlign w:val="center"/>
           </w:tcPr>
           <w:p>
@@ -1392,7 +2066,7 @@
         </w:tc>
         <w:tc>
           <w:tcPr>
-            <w:tcW w:w="1308" w:type="dxa"/>
+            <w:tcW w:w="975" w:type="dxa"/>
             <w:vAlign w:val="center"/>
           </w:tcPr>
           <w:p>
@@ -1412,7 +2086,7 @@
         </w:tc>
         <w:tc>
           <w:tcPr>
-            <w:tcW w:w="1309" w:type="dxa"/>
+            <w:tcW w:w="912" w:type="dxa"/>
             <w:vAlign w:val="center"/>
           </w:tcPr>
           <w:p>
@@ -1432,7 +2106,7 @@
         </w:tc>
         <w:tc>
           <w:tcPr>
-            <w:tcW w:w="1309" w:type="dxa"/>
+            <w:tcW w:w="934" w:type="dxa"/>
             <w:vAlign w:val="center"/>
           </w:tcPr>
           <w:p>
@@ -1452,7 +2126,27 @@
         </w:tc>
         <w:tc>
           <w:tcPr>
-            <w:tcW w:w="1309" w:type="dxa"/>
+            <w:tcW w:w="1108" w:type="dxa"/>
+            <w:vAlign w:val="center"/>
+          </w:tcPr>
+          <w:p>
+            <w:pPr>
+              <w:jc w:val="center"/>
+              <w:rPr>
+                <w:bCs/>
+              </w:rPr>
+            </w:pPr>
+            <w:r>
+              <w:rPr>
+                <w:bCs/>
+              </w:rPr>
+              <w:t>2.18</w:t>
+            </w:r>
+          </w:p>
+        </w:tc>
+        <w:tc>
+          <w:tcPr>
+            <w:tcW w:w="982" w:type="dxa"/>
             <w:vAlign w:val="center"/>
           </w:tcPr>
           <w:p>
@@ -1472,7 +2166,7 @@
         </w:tc>
         <w:tc>
           <w:tcPr>
-            <w:tcW w:w="1308" w:type="dxa"/>
+            <w:tcW w:w="934" w:type="dxa"/>
             <w:vAlign w:val="center"/>
           </w:tcPr>
           <w:p>
@@ -1492,35 +2186,107 @@
         </w:tc>
         <w:tc>
           <w:tcPr>
-            <w:tcW w:w="1309" w:type="dxa"/>
-            <w:vAlign w:val="center"/>
-          </w:tcPr>
-          <w:p>
-            <w:pPr>
-              <w:jc w:val="center"/>
-              <w:rPr>
-                <w:bCs/>
-              </w:rPr>
-            </w:pPr>
-          </w:p>
-        </w:tc>
-        <w:tc>
-          <w:tcPr>
-            <w:tcW w:w="1309" w:type="dxa"/>
-            <w:vAlign w:val="center"/>
-          </w:tcPr>
-          <w:p>
-            <w:pPr>
-              <w:jc w:val="center"/>
-              <w:rPr>
-                <w:bCs/>
-              </w:rPr>
-            </w:pPr>
-          </w:p>
-        </w:tc>
-        <w:tc>
-          <w:tcPr>
-            <w:tcW w:w="1309" w:type="dxa"/>
+            <w:tcW w:w="1041" w:type="dxa"/>
+            <w:vAlign w:val="center"/>
+          </w:tcPr>
+          <w:p>
+            <w:pPr>
+              <w:jc w:val="center"/>
+              <w:rPr>
+                <w:bCs/>
+              </w:rPr>
+            </w:pPr>
+            <w:r>
+              <w:rPr>
+                <w:bCs/>
+              </w:rPr>
+              <w:t>80410.4</w:t>
+            </w:r>
+            <w:r>
+              <w:rPr>
+                <w:bCs/>
+              </w:rPr>
+              <w:t>9</w:t>
+            </w:r>
+          </w:p>
+        </w:tc>
+        <w:tc>
+          <w:tcPr>
+            <w:tcW w:w="1041" w:type="dxa"/>
+            <w:vAlign w:val="center"/>
+          </w:tcPr>
+          <w:p>
+            <w:pPr>
+              <w:jc w:val="center"/>
+              <w:rPr>
+                <w:bCs/>
+              </w:rPr>
+            </w:pPr>
+            <w:r>
+              <w:rPr>
+                <w:bCs/>
+              </w:rPr>
+              <w:t>80445.7</w:t>
+            </w:r>
+            <w:r>
+              <w:rPr>
+                <w:bCs/>
+              </w:rPr>
+              <w:t>7</w:t>
+            </w:r>
+          </w:p>
+        </w:tc>
+        <w:tc>
+          <w:tcPr>
+            <w:tcW w:w="1041" w:type="dxa"/>
+            <w:vAlign w:val="center"/>
+          </w:tcPr>
+          <w:p>
+            <w:pPr>
+              <w:jc w:val="center"/>
+              <w:rPr>
+                <w:bCs/>
+              </w:rPr>
+            </w:pPr>
+            <w:r>
+              <w:rPr>
+                <w:bCs/>
+              </w:rPr>
+              <w:t>80426.70</w:t>
+            </w:r>
+          </w:p>
+        </w:tc>
+        <w:tc>
+          <w:tcPr>
+            <w:tcW w:w="1091" w:type="dxa"/>
+            <w:vAlign w:val="center"/>
+          </w:tcPr>
+          <w:p>
+            <w:pPr>
+              <w:jc w:val="center"/>
+              <w:rPr>
+                <w:bCs/>
+              </w:rPr>
+            </w:pPr>
+          </w:p>
+        </w:tc>
+        <w:tc>
+          <w:tcPr>
+            <w:tcW w:w="924" w:type="dxa"/>
+            <w:vAlign w:val="center"/>
+          </w:tcPr>
+          <w:p>
+            <w:pPr>
+              <w:jc w:val="center"/>
+              <w:rPr>
+                <w:bCs/>
+              </w:rPr>
+            </w:pPr>
+          </w:p>
+        </w:tc>
+        <w:tc>
+          <w:tcPr>
+            <w:tcW w:w="931" w:type="dxa"/>
             <w:vAlign w:val="center"/>
           </w:tcPr>
           <w:p>
@@ -1535,11 +2301,11 @@
       </w:tr>
       <w:tr>
         <w:trPr>
-          <w:trHeight w:val="425"/>
+          <w:trHeight w:val="427"/>
         </w:trPr>
         <w:tc>
           <w:tcPr>
-            <w:tcW w:w="3605" w:type="dxa"/>
+            <w:tcW w:w="2590" w:type="dxa"/>
             <w:vAlign w:val="center"/>
           </w:tcPr>
           <w:p>
@@ -1556,7 +2322,7 @@
         </w:tc>
         <w:tc>
           <w:tcPr>
-            <w:tcW w:w="1308" w:type="dxa"/>
+            <w:tcW w:w="975" w:type="dxa"/>
             <w:vAlign w:val="center"/>
           </w:tcPr>
           <w:p>
@@ -1576,7 +2342,7 @@
         </w:tc>
         <w:tc>
           <w:tcPr>
-            <w:tcW w:w="1309" w:type="dxa"/>
+            <w:tcW w:w="912" w:type="dxa"/>
             <w:vAlign w:val="center"/>
           </w:tcPr>
           <w:p>
@@ -1596,7 +2362,7 @@
         </w:tc>
         <w:tc>
           <w:tcPr>
-            <w:tcW w:w="1309" w:type="dxa"/>
+            <w:tcW w:w="934" w:type="dxa"/>
             <w:vAlign w:val="center"/>
           </w:tcPr>
           <w:p>
@@ -1616,7 +2382,33 @@
         </w:tc>
         <w:tc>
           <w:tcPr>
-            <w:tcW w:w="1309" w:type="dxa"/>
+            <w:tcW w:w="1108" w:type="dxa"/>
+            <w:vAlign w:val="center"/>
+          </w:tcPr>
+          <w:p>
+            <w:pPr>
+              <w:jc w:val="center"/>
+              <w:rPr>
+                <w:bCs/>
+              </w:rPr>
+            </w:pPr>
+            <w:r>
+              <w:rPr>
+                <w:bCs/>
+              </w:rPr>
+              <w:t>2.</w:t>
+            </w:r>
+            <w:r>
+              <w:rPr>
+                <w:bCs/>
+              </w:rPr>
+              <w:t>39</w:t>
+            </w:r>
+          </w:p>
+        </w:tc>
+        <w:tc>
+          <w:tcPr>
+            <w:tcW w:w="982" w:type="dxa"/>
             <w:vAlign w:val="center"/>
           </w:tcPr>
           <w:p>
@@ -1636,7 +2428,7 @@
         </w:tc>
         <w:tc>
           <w:tcPr>
-            <w:tcW w:w="1308" w:type="dxa"/>
+            <w:tcW w:w="934" w:type="dxa"/>
             <w:vAlign w:val="center"/>
           </w:tcPr>
           <w:p>
@@ -1656,35 +2448,101 @@
         </w:tc>
         <w:tc>
           <w:tcPr>
-            <w:tcW w:w="1309" w:type="dxa"/>
-            <w:vAlign w:val="center"/>
-          </w:tcPr>
-          <w:p>
-            <w:pPr>
-              <w:jc w:val="center"/>
-              <w:rPr>
-                <w:bCs/>
-              </w:rPr>
-            </w:pPr>
-          </w:p>
-        </w:tc>
-        <w:tc>
-          <w:tcPr>
-            <w:tcW w:w="1309" w:type="dxa"/>
-            <w:vAlign w:val="center"/>
-          </w:tcPr>
-          <w:p>
-            <w:pPr>
-              <w:jc w:val="center"/>
-              <w:rPr>
-                <w:bCs/>
-              </w:rPr>
-            </w:pPr>
-          </w:p>
-        </w:tc>
-        <w:tc>
-          <w:tcPr>
-            <w:tcW w:w="1309" w:type="dxa"/>
+            <w:tcW w:w="1041" w:type="dxa"/>
+            <w:vAlign w:val="center"/>
+          </w:tcPr>
+          <w:p>
+            <w:pPr>
+              <w:jc w:val="center"/>
+              <w:rPr>
+                <w:bCs/>
+              </w:rPr>
+            </w:pPr>
+            <w:r>
+              <w:rPr>
+                <w:bCs/>
+              </w:rPr>
+              <w:t>80147.53</w:t>
+            </w:r>
+          </w:p>
+        </w:tc>
+        <w:tc>
+          <w:tcPr>
+            <w:tcW w:w="1041" w:type="dxa"/>
+            <w:vAlign w:val="center"/>
+          </w:tcPr>
+          <w:p>
+            <w:pPr>
+              <w:jc w:val="center"/>
+              <w:rPr>
+                <w:bCs/>
+              </w:rPr>
+            </w:pPr>
+            <w:r>
+              <w:rPr>
+                <w:bCs/>
+              </w:rPr>
+              <w:t>80206.33</w:t>
+            </w:r>
+          </w:p>
+        </w:tc>
+        <w:tc>
+          <w:tcPr>
+            <w:tcW w:w="1041" w:type="dxa"/>
+            <w:vAlign w:val="center"/>
+          </w:tcPr>
+          <w:p>
+            <w:pPr>
+              <w:jc w:val="center"/>
+              <w:rPr>
+                <w:bCs/>
+              </w:rPr>
+            </w:pPr>
+            <w:r>
+              <w:rPr>
+                <w:bCs/>
+              </w:rPr>
+              <w:t>80174.5</w:t>
+            </w:r>
+            <w:r>
+              <w:rPr>
+                <w:bCs/>
+              </w:rPr>
+              <w:t>6</w:t>
+            </w:r>
+          </w:p>
+        </w:tc>
+        <w:tc>
+          <w:tcPr>
+            <w:tcW w:w="1091" w:type="dxa"/>
+            <w:vAlign w:val="center"/>
+          </w:tcPr>
+          <w:p>
+            <w:pPr>
+              <w:jc w:val="center"/>
+              <w:rPr>
+                <w:bCs/>
+              </w:rPr>
+            </w:pPr>
+          </w:p>
+        </w:tc>
+        <w:tc>
+          <w:tcPr>
+            <w:tcW w:w="924" w:type="dxa"/>
+            <w:vAlign w:val="center"/>
+          </w:tcPr>
+          <w:p>
+            <w:pPr>
+              <w:jc w:val="center"/>
+              <w:rPr>
+                <w:bCs/>
+              </w:rPr>
+            </w:pPr>
+          </w:p>
+        </w:tc>
+        <w:tc>
+          <w:tcPr>
+            <w:tcW w:w="931" w:type="dxa"/>
             <w:vAlign w:val="center"/>
           </w:tcPr>
           <w:p>
@@ -1699,11 +2557,11 @@
       </w:tr>
       <w:tr>
         <w:trPr>
-          <w:trHeight w:val="425"/>
+          <w:trHeight w:val="427"/>
         </w:trPr>
         <w:tc>
           <w:tcPr>
-            <w:tcW w:w="3605" w:type="dxa"/>
+            <w:tcW w:w="2590" w:type="dxa"/>
             <w:tcBorders>
               <w:bottom w:val="single" w:sz="4" w:space="0" w:color="auto"/>
             </w:tcBorders>
@@ -1723,7 +2581,7 @@
         </w:tc>
         <w:tc>
           <w:tcPr>
-            <w:tcW w:w="1308" w:type="dxa"/>
+            <w:tcW w:w="975" w:type="dxa"/>
             <w:tcBorders>
               <w:bottom w:val="single" w:sz="4" w:space="0" w:color="auto"/>
             </w:tcBorders>
@@ -1733,12 +2591,12 @@
             <w:pPr>
               <w:jc w:val="center"/>
               <w:rPr>
-                <w:bCs/>
-              </w:rPr>
-            </w:pPr>
-            <w:r>
-              <w:rPr>
-                <w:bCs/>
+                <w:b/>
+              </w:rPr>
+            </w:pPr>
+            <w:r>
+              <w:rPr>
+                <w:b/>
               </w:rPr>
               <w:t>38.05</w:t>
             </w:r>
@@ -1746,7 +2604,7 @@
         </w:tc>
         <w:tc>
           <w:tcPr>
-            <w:tcW w:w="1309" w:type="dxa"/>
+            <w:tcW w:w="912" w:type="dxa"/>
             <w:tcBorders>
               <w:bottom w:val="single" w:sz="4" w:space="0" w:color="auto"/>
             </w:tcBorders>
@@ -1756,12 +2614,12 @@
             <w:pPr>
               <w:jc w:val="center"/>
               <w:rPr>
-                <w:bCs/>
-              </w:rPr>
-            </w:pPr>
-            <w:r>
-              <w:rPr>
-                <w:bCs/>
+                <w:b/>
+              </w:rPr>
+            </w:pPr>
+            <w:r>
+              <w:rPr>
+                <w:b/>
               </w:rPr>
               <w:t>6</w:t>
             </w:r>
@@ -1769,7 +2627,7 @@
         </w:tc>
         <w:tc>
           <w:tcPr>
-            <w:tcW w:w="1309" w:type="dxa"/>
+            <w:tcW w:w="934" w:type="dxa"/>
             <w:tcBorders>
               <w:bottom w:val="single" w:sz="4" w:space="0" w:color="auto"/>
             </w:tcBorders>
@@ -1779,12 +2637,12 @@
             <w:pPr>
               <w:jc w:val="center"/>
               <w:rPr>
-                <w:bCs/>
-              </w:rPr>
-            </w:pPr>
-            <w:r>
-              <w:rPr>
-                <w:bCs/>
+                <w:b/>
+              </w:rPr>
+            </w:pPr>
+            <w:r>
+              <w:rPr>
+                <w:b/>
               </w:rPr>
               <w:t>&lt; .001</w:t>
             </w:r>
@@ -1792,7 +2650,7 @@
         </w:tc>
         <w:tc>
           <w:tcPr>
-            <w:tcW w:w="1309" w:type="dxa"/>
+            <w:tcW w:w="1108" w:type="dxa"/>
             <w:tcBorders>
               <w:bottom w:val="single" w:sz="4" w:space="0" w:color="auto"/>
             </w:tcBorders>
@@ -1802,20 +2660,20 @@
             <w:pPr>
               <w:jc w:val="center"/>
               <w:rPr>
-                <w:bCs/>
-              </w:rPr>
-            </w:pPr>
-            <w:r>
-              <w:rPr>
-                <w:bCs/>
-              </w:rPr>
-              <w:t>0.05</w:t>
-            </w:r>
-          </w:p>
-        </w:tc>
-        <w:tc>
-          <w:tcPr>
-            <w:tcW w:w="1308" w:type="dxa"/>
+                <w:b/>
+              </w:rPr>
+            </w:pPr>
+            <w:r>
+              <w:rPr>
+                <w:b/>
+              </w:rPr>
+              <w:t>2.40</w:t>
+            </w:r>
+          </w:p>
+        </w:tc>
+        <w:tc>
+          <w:tcPr>
+            <w:tcW w:w="982" w:type="dxa"/>
             <w:tcBorders>
               <w:bottom w:val="single" w:sz="4" w:space="0" w:color="auto"/>
             </w:tcBorders>
@@ -1825,20 +2683,20 @@
             <w:pPr>
               <w:jc w:val="center"/>
               <w:rPr>
-                <w:bCs/>
-              </w:rPr>
-            </w:pPr>
-            <w:r>
-              <w:rPr>
-                <w:bCs/>
-              </w:rPr>
-              <w:t>0.99</w:t>
-            </w:r>
-          </w:p>
-        </w:tc>
-        <w:tc>
-          <w:tcPr>
-            <w:tcW w:w="1309" w:type="dxa"/>
+                <w:b/>
+              </w:rPr>
+            </w:pPr>
+            <w:r>
+              <w:rPr>
+                <w:b/>
+              </w:rPr>
+              <w:t>0.05</w:t>
+            </w:r>
+          </w:p>
+        </w:tc>
+        <w:tc>
+          <w:tcPr>
+            <w:tcW w:w="934" w:type="dxa"/>
             <w:tcBorders>
               <w:bottom w:val="single" w:sz="4" w:space="0" w:color="auto"/>
             </w:tcBorders>
@@ -1848,14 +2706,20 @@
             <w:pPr>
               <w:jc w:val="center"/>
               <w:rPr>
-                <w:bCs/>
-              </w:rPr>
-            </w:pPr>
-          </w:p>
-        </w:tc>
-        <w:tc>
-          <w:tcPr>
-            <w:tcW w:w="1309" w:type="dxa"/>
+                <w:b/>
+              </w:rPr>
+            </w:pPr>
+            <w:r>
+              <w:rPr>
+                <w:b/>
+              </w:rPr>
+              <w:t>0.99</w:t>
+            </w:r>
+          </w:p>
+        </w:tc>
+        <w:tc>
+          <w:tcPr>
+            <w:tcW w:w="1041" w:type="dxa"/>
             <w:tcBorders>
               <w:bottom w:val="single" w:sz="4" w:space="0" w:color="auto"/>
             </w:tcBorders>
@@ -1865,14 +2729,118 @@
             <w:pPr>
               <w:jc w:val="center"/>
               <w:rPr>
-                <w:bCs/>
-              </w:rPr>
-            </w:pPr>
-          </w:p>
-        </w:tc>
-        <w:tc>
-          <w:tcPr>
-            <w:tcW w:w="1309" w:type="dxa"/>
+                <w:b/>
+              </w:rPr>
+            </w:pPr>
+            <w:r>
+              <w:rPr>
+                <w:b/>
+              </w:rPr>
+              <w:t>80155.7</w:t>
+            </w:r>
+            <w:r>
+              <w:rPr>
+                <w:b/>
+              </w:rPr>
+              <w:t>3</w:t>
+            </w:r>
+          </w:p>
+        </w:tc>
+        <w:tc>
+          <w:tcPr>
+            <w:tcW w:w="1041" w:type="dxa"/>
+            <w:tcBorders>
+              <w:bottom w:val="single" w:sz="4" w:space="0" w:color="auto"/>
+            </w:tcBorders>
+            <w:vAlign w:val="center"/>
+          </w:tcPr>
+          <w:p>
+            <w:pPr>
+              <w:jc w:val="center"/>
+              <w:rPr>
+                <w:b/>
+              </w:rPr>
+            </w:pPr>
+            <w:r>
+              <w:rPr>
+                <w:b/>
+              </w:rPr>
+              <w:t>80202.7</w:t>
+            </w:r>
+            <w:r>
+              <w:rPr>
+                <w:b/>
+              </w:rPr>
+              <w:t>7</w:t>
+            </w:r>
+          </w:p>
+        </w:tc>
+        <w:tc>
+          <w:tcPr>
+            <w:tcW w:w="1041" w:type="dxa"/>
+            <w:tcBorders>
+              <w:bottom w:val="single" w:sz="4" w:space="0" w:color="auto"/>
+            </w:tcBorders>
+            <w:vAlign w:val="center"/>
+          </w:tcPr>
+          <w:p>
+            <w:pPr>
+              <w:jc w:val="center"/>
+              <w:rPr>
+                <w:b/>
+              </w:rPr>
+            </w:pPr>
+            <w:r>
+              <w:rPr>
+                <w:b/>
+              </w:rPr>
+              <w:t>80177.3</w:t>
+            </w:r>
+            <w:r>
+              <w:rPr>
+                <w:b/>
+              </w:rPr>
+              <w:t>5</w:t>
+            </w:r>
+          </w:p>
+        </w:tc>
+        <w:tc>
+          <w:tcPr>
+            <w:tcW w:w="1091" w:type="dxa"/>
+            <w:tcBorders>
+              <w:bottom w:val="single" w:sz="4" w:space="0" w:color="auto"/>
+            </w:tcBorders>
+            <w:vAlign w:val="center"/>
+          </w:tcPr>
+          <w:p>
+            <w:pPr>
+              <w:jc w:val="center"/>
+              <w:rPr>
+                <w:bCs/>
+              </w:rPr>
+            </w:pPr>
+          </w:p>
+        </w:tc>
+        <w:tc>
+          <w:tcPr>
+            <w:tcW w:w="924" w:type="dxa"/>
+            <w:tcBorders>
+              <w:bottom w:val="single" w:sz="4" w:space="0" w:color="auto"/>
+            </w:tcBorders>
+            <w:vAlign w:val="center"/>
+          </w:tcPr>
+          <w:p>
+            <w:pPr>
+              <w:jc w:val="center"/>
+              <w:rPr>
+                <w:bCs/>
+              </w:rPr>
+            </w:pPr>
+          </w:p>
+        </w:tc>
+        <w:tc>
+          <w:tcPr>
+            <w:tcW w:w="931" w:type="dxa"/>
             <w:tcBorders>
               <w:bottom w:val="single" w:sz="4" w:space="0" w:color="auto"/>
             </w:tcBorders>
@@ -1998,6 +2966,15 @@
         </w:rPr>
         <w:t>bility of the difference tests.</w:t>
       </w:r>
+      <w:r>
+        <w:rPr>
+          <w:rFonts w:eastAsia="Calibri"/>
+        </w:rPr>
+        <w:t xml:space="preserve"> </w:t>
+      </w:r>
+      <w:r>
+        <w:t>Lower values of Akaike Information Criteria (AIC), Bayesian Information Criteria (BIC), and sample size-adjusted Bayesian Information Criteria (SABIC) indicate better fit.</w:t>
+      </w:r>
     </w:p>
     <w:p>
       <w:pPr>
@@ -2028,6 +3005,46 @@
     </w:sectPr>
   </w:body>
 </w:document>
+</file>
+
+<file path=word/comments.xml><?xml version="1.0" encoding="utf-8"?>
+<w:comments xmlns:wpc="http://schemas.microsoft.com/office/word/2010/wordprocessingCanvas" xmlns:cx="http://schemas.microsoft.com/office/drawing/2014/chartex" xmlns:cx1="http://schemas.microsoft.com/office/drawing/2015/9/8/chartex" xmlns:cx2="http://schemas.microsoft.com/office/drawing/2015/10/21/chartex" xmlns:cx3="http://schemas.microsoft.com/office/drawing/2016/5/9/chartex" xmlns:cx4="http://schemas.microsoft.com/office/drawing/2016/5/10/chartex" xmlns:cx5="http://schemas.microsoft.com/office/drawing/2016/5/11/chartex" xmlns:cx6="http://schemas.microsoft.com/office/drawing/2016/5/12/chartex" xmlns:cx7="http://schemas.microsoft.com/office/drawing/2016/5/13/chartex" xmlns:cx8="http://schemas.microsoft.com/office/drawing/2016/5/14/chartex" xmlns:mc="http://schemas.openxmlformats.org/markup-compatibility/2006" xmlns:aink="http://schemas.microsoft.com/office/drawing/2016/ink" xmlns:am3d="http://schemas.microsoft.com/office/drawing/2017/model3d" xmlns:o="urn:schemas-microsoft-com:office:office" xmlns:oel="http://schemas.microsoft.com/office/2019/extlst" xmlns:r="http://schemas.openxmlformats.org/officeDocument/2006/relationships" xmlns:m="http://schemas.openxmlformats.org/officeDocument/2006/math" xmlns:v="urn:schemas-microsoft-com:vml" xmlns:wp14="http://schemas.microsoft.com/office/word/2010/wordprocessingDrawing" xmlns:wp="http://schemas.openxmlformats.org/drawingml/2006/wordprocessingDrawing" xmlns:w10="urn:schemas-microsoft-com:office:word" xmlns:w="http://schemas.openxmlformats.org/wordprocessingml/2006/main" xmlns:w14="http://schemas.microsoft.com/office/word/2010/wordml" xmlns:w15="http://schemas.microsoft.com/office/word/2012/wordml" xmlns:w16cex="http://schemas.microsoft.com/office/word/2018/wordml/cex" xmlns:w16cid="http://schemas.microsoft.com/office/word/2016/wordml/cid" xmlns:w16="http://schemas.microsoft.com/office/word/2018/wordml" xmlns:w16du="http://schemas.microsoft.com/office/word/2023/wordml/word16du" xmlns:w16sdtdh="http://schemas.microsoft.com/office/word/2020/wordml/sdtdatahash" xmlns:w16sdtfl="http://schemas.microsoft.com/office/word/2024/wordml/sdtformatlock" xmlns:w16se="http://schemas.microsoft.com/office/word/2015/wordml/symex" xmlns:wpg="http://schemas.microsoft.com/office/word/2010/wordprocessingGroup" xmlns:wpi="http://schemas.microsoft.com/office/word/2010/wordprocessingInk" xmlns:wne="http://schemas.microsoft.com/office/word/2006/wordml" xmlns:wps="http://schemas.microsoft.com/office/word/2010/wordprocessingShape" mc:Ignorable="w14 w15 w16se w16cid w16 w16cex w16sdtdh w16sdtfl w16du wp14">
+  <w:comment w:id="0" w:author="Alexis Brieant" w:date="2025-08-22T12:28:00Z" w:initials="AB">
+    <w:p>
+      <w:r>
+        <w:rPr>
+          <w:rStyle w:val="CommentReference"/>
+        </w:rPr>
+        <w:annotationRef/>
+      </w:r>
+      <w:r>
+        <w:rPr>
+          <w:sz w:val="20"/>
+          <w:szCs w:val="20"/>
+        </w:rPr>
+        <w:t>For nested models only</w:t>
+      </w:r>
+    </w:p>
+  </w:comment>
+</w:comments>
+</file>
+
+<file path=word/commentsExtended.xml><?xml version="1.0" encoding="utf-8"?>
+<w15:commentsEx xmlns:wpc="http://schemas.microsoft.com/office/word/2010/wordprocessingCanvas" xmlns:cx="http://schemas.microsoft.com/office/drawing/2014/chartex" xmlns:cx1="http://schemas.microsoft.com/office/drawing/2015/9/8/chartex" xmlns:cx2="http://schemas.microsoft.com/office/drawing/2015/10/21/chartex" xmlns:cx3="http://schemas.microsoft.com/office/drawing/2016/5/9/chartex" xmlns:cx4="http://schemas.microsoft.com/office/drawing/2016/5/10/chartex" xmlns:cx5="http://schemas.microsoft.com/office/drawing/2016/5/11/chartex" xmlns:cx6="http://schemas.microsoft.com/office/drawing/2016/5/12/chartex" xmlns:cx7="http://schemas.microsoft.com/office/drawing/2016/5/13/chartex" xmlns:cx8="http://schemas.microsoft.com/office/drawing/2016/5/14/chartex" xmlns:mc="http://schemas.openxmlformats.org/markup-compatibility/2006" xmlns:aink="http://schemas.microsoft.com/office/drawing/2016/ink" xmlns:am3d="http://schemas.microsoft.com/office/drawing/2017/model3d" xmlns:o="urn:schemas-microsoft-com:office:office" xmlns:oel="http://schemas.microsoft.com/office/2019/extlst" xmlns:r="http://schemas.openxmlformats.org/officeDocument/2006/relationships" xmlns:m="http://schemas.openxmlformats.org/officeDocument/2006/math" xmlns:v="urn:schemas-microsoft-com:vml" xmlns:wp14="http://schemas.microsoft.com/office/word/2010/wordprocessingDrawing" xmlns:wp="http://schemas.openxmlformats.org/drawingml/2006/wordprocessingDrawing" xmlns:w10="urn:schemas-microsoft-com:office:word" xmlns:w="http://schemas.openxmlformats.org/wordprocessingml/2006/main" xmlns:w14="http://schemas.microsoft.com/office/word/2010/wordml" xmlns:w15="http://schemas.microsoft.com/office/word/2012/wordml" xmlns:w16cex="http://schemas.microsoft.com/office/word/2018/wordml/cex" xmlns:w16cid="http://schemas.microsoft.com/office/word/2016/wordml/cid" xmlns:w16="http://schemas.microsoft.com/office/word/2018/wordml" xmlns:w16du="http://schemas.microsoft.com/office/word/2023/wordml/word16du" xmlns:w16sdtdh="http://schemas.microsoft.com/office/word/2020/wordml/sdtdatahash" xmlns:w16sdtfl="http://schemas.microsoft.com/office/word/2024/wordml/sdtformatlock" xmlns:w16se="http://schemas.microsoft.com/office/word/2015/wordml/symex" xmlns:wpg="http://schemas.microsoft.com/office/word/2010/wordprocessingGroup" xmlns:wpi="http://schemas.microsoft.com/office/word/2010/wordprocessingInk" xmlns:wne="http://schemas.microsoft.com/office/word/2006/wordml" xmlns:wps="http://schemas.microsoft.com/office/word/2010/wordprocessingShape" mc:Ignorable="w14 w15 w16se w16cid w16 w16cex w16sdtdh w16sdtfl w16du wp14">
+  <w15:commentEx w15:paraId="7F9B9F7B" w15:done="0"/>
+</w15:commentsEx>
+</file>
+
+<file path=word/commentsExtensible.xml><?xml version="1.0" encoding="utf-8"?>
+<w16cex:commentsExtensible xmlns:wpc="http://schemas.microsoft.com/office/word/2010/wordprocessingCanvas" xmlns:cx="http://schemas.microsoft.com/office/drawing/2014/chartex" xmlns:cx1="http://schemas.microsoft.com/office/drawing/2015/9/8/chartex" xmlns:cx2="http://schemas.microsoft.com/office/drawing/2015/10/21/chartex" xmlns:cx3="http://schemas.microsoft.com/office/drawing/2016/5/9/chartex" xmlns:cx4="http://schemas.microsoft.com/office/drawing/2016/5/10/chartex" xmlns:cx5="http://schemas.microsoft.com/office/drawing/2016/5/11/chartex" xmlns:cx6="http://schemas.microsoft.com/office/drawing/2016/5/12/chartex" xmlns:cx7="http://schemas.microsoft.com/office/drawing/2016/5/13/chartex" xmlns:cx8="http://schemas.microsoft.com/office/drawing/2016/5/14/chartex" xmlns:cr="http://schemas.microsoft.com/office/comments/2020/reactions" xmlns:mc="http://schemas.openxmlformats.org/markup-compatibility/2006" xmlns:aink="http://schemas.microsoft.com/office/drawing/2016/ink" xmlns:am3d="http://schemas.microsoft.com/office/drawing/2017/model3d" xmlns:o="urn:schemas-microsoft-com:office:office" xmlns:oel="http://schemas.microsoft.com/office/2019/extlst" xmlns:r="http://schemas.openxmlformats.org/officeDocument/2006/relationships" xmlns:m="http://schemas.openxmlformats.org/officeDocument/2006/math" xmlns:v="urn:schemas-microsoft-com:vml" xmlns:wp14="http://schemas.microsoft.com/office/word/2010/wordprocessingDrawing" xmlns:wp="http://schemas.openxmlformats.org/drawingml/2006/wordprocessingDrawing" xmlns:w10="urn:schemas-microsoft-com:office:word" xmlns:w="http://schemas.openxmlformats.org/wordprocessingml/2006/main" xmlns:w14="http://schemas.microsoft.com/office/word/2010/wordml" xmlns:w15="http://schemas.microsoft.com/office/word/2012/wordml" xmlns:w16cex="http://schemas.microsoft.com/office/word/2018/wordml/cex" xmlns:w16cid="http://schemas.microsoft.com/office/word/2016/wordml/cid" xmlns:w16="http://schemas.microsoft.com/office/word/2018/wordml" xmlns:w16du="http://schemas.microsoft.com/office/word/2023/wordml/word16du" xmlns:w16sdtdh="http://schemas.microsoft.com/office/word/2020/wordml/sdtdatahash" xmlns:w16sdtfl="http://schemas.microsoft.com/office/word/2024/wordml/sdtformatlock" xmlns:w16se="http://schemas.microsoft.com/office/word/2015/wordml/symex" xmlns:wpg="http://schemas.microsoft.com/office/word/2010/wordprocessingGroup" xmlns:wpi="http://schemas.microsoft.com/office/word/2010/wordprocessingInk" xmlns:wne="http://schemas.microsoft.com/office/word/2006/wordml" xmlns:wps="http://schemas.microsoft.com/office/word/2010/wordprocessingShape" mc:Ignorable="w14 w15 w16se w16cid w16 w16cex w16sdtdh w16sdtfl cr w16du wp14">
+  <w16cex:commentExtensible w16cex:durableId="42F86D46" w16cex:dateUtc="2025-08-22T16:28:00Z"/>
+</w16cex:commentsExtensible>
+</file>
+
+<file path=word/commentsIds.xml><?xml version="1.0" encoding="utf-8"?>
+<w16cid:commentsIds xmlns:wpc="http://schemas.microsoft.com/office/word/2010/wordprocessingCanvas" xmlns:cx="http://schemas.microsoft.com/office/drawing/2014/chartex" xmlns:cx1="http://schemas.microsoft.com/office/drawing/2015/9/8/chartex" xmlns:cx2="http://schemas.microsoft.com/office/drawing/2015/10/21/chartex" xmlns:cx3="http://schemas.microsoft.com/office/drawing/2016/5/9/chartex" xmlns:cx4="http://schemas.microsoft.com/office/drawing/2016/5/10/chartex" xmlns:cx5="http://schemas.microsoft.com/office/drawing/2016/5/11/chartex" xmlns:cx6="http://schemas.microsoft.com/office/drawing/2016/5/12/chartex" xmlns:cx7="http://schemas.microsoft.com/office/drawing/2016/5/13/chartex" xmlns:cx8="http://schemas.microsoft.com/office/drawing/2016/5/14/chartex" xmlns:mc="http://schemas.openxmlformats.org/markup-compatibility/2006" xmlns:aink="http://schemas.microsoft.com/office/drawing/2016/ink" xmlns:am3d="http://schemas.microsoft.com/office/drawing/2017/model3d" xmlns:o="urn:schemas-microsoft-com:office:office" xmlns:oel="http://schemas.microsoft.com/office/2019/extlst" xmlns:r="http://schemas.openxmlformats.org/officeDocument/2006/relationships" xmlns:m="http://schemas.openxmlformats.org/officeDocument/2006/math" xmlns:v="urn:schemas-microsoft-com:vml" xmlns:wp14="http://schemas.microsoft.com/office/word/2010/wordprocessingDrawing" xmlns:wp="http://schemas.openxmlformats.org/drawingml/2006/wordprocessingDrawing" xmlns:w10="urn:schemas-microsoft-com:office:word" xmlns:w="http://schemas.openxmlformats.org/wordprocessingml/2006/main" xmlns:w14="http://schemas.microsoft.com/office/word/2010/wordml" xmlns:w15="http://schemas.microsoft.com/office/word/2012/wordml" xmlns:w16cex="http://schemas.microsoft.com/office/word/2018/wordml/cex" xmlns:w16cid="http://schemas.microsoft.com/office/word/2016/wordml/cid" xmlns:w16="http://schemas.microsoft.com/office/word/2018/wordml" xmlns:w16du="http://schemas.microsoft.com/office/word/2023/wordml/word16du" xmlns:w16sdtdh="http://schemas.microsoft.com/office/word/2020/wordml/sdtdatahash" xmlns:w16sdtfl="http://schemas.microsoft.com/office/word/2024/wordml/sdtformatlock" xmlns:w16se="http://schemas.microsoft.com/office/word/2015/wordml/symex" xmlns:wpg="http://schemas.microsoft.com/office/word/2010/wordprocessingGroup" xmlns:wpi="http://schemas.microsoft.com/office/word/2010/wordprocessingInk" xmlns:wne="http://schemas.microsoft.com/office/word/2006/wordml" xmlns:wps="http://schemas.microsoft.com/office/word/2010/wordprocessingShape" mc:Ignorable="w14 w15 w16se w16cid w16 w16cex w16sdtdh w16sdtfl w16du wp14">
+  <w16cid:commentId w16cid:paraId="7F9B9F7B" w16cid:durableId="42F86D46"/>
+</w16cid:commentsIds>
 </file>
 
 <file path=word/numbering.xml><?xml version="1.0" encoding="utf-8"?>
@@ -2122,6 +3139,14 @@
     <w:abstractNumId w:val="0"/>
   </w:num>
 </w:numbering>
+</file>
+
+<file path=word/people.xml><?xml version="1.0" encoding="utf-8"?>
+<w15:people xmlns:wpc="http://schemas.microsoft.com/office/word/2010/wordprocessingCanvas" xmlns:cx="http://schemas.microsoft.com/office/drawing/2014/chartex" xmlns:cx1="http://schemas.microsoft.com/office/drawing/2015/9/8/chartex" xmlns:cx2="http://schemas.microsoft.com/office/drawing/2015/10/21/chartex" xmlns:cx3="http://schemas.microsoft.com/office/drawing/2016/5/9/chartex" xmlns:cx4="http://schemas.microsoft.com/office/drawing/2016/5/10/chartex" xmlns:cx5="http://schemas.microsoft.com/office/drawing/2016/5/11/chartex" xmlns:cx6="http://schemas.microsoft.com/office/drawing/2016/5/12/chartex" xmlns:cx7="http://schemas.microsoft.com/office/drawing/2016/5/13/chartex" xmlns:cx8="http://schemas.microsoft.com/office/drawing/2016/5/14/chartex" xmlns:mc="http://schemas.openxmlformats.org/markup-compatibility/2006" xmlns:aink="http://schemas.microsoft.com/office/drawing/2016/ink" xmlns:am3d="http://schemas.microsoft.com/office/drawing/2017/model3d" xmlns:o="urn:schemas-microsoft-com:office:office" xmlns:oel="http://schemas.microsoft.com/office/2019/extlst" xmlns:r="http://schemas.openxmlformats.org/officeDocument/2006/relationships" xmlns:m="http://schemas.openxmlformats.org/officeDocument/2006/math" xmlns:v="urn:schemas-microsoft-com:vml" xmlns:wp14="http://schemas.microsoft.com/office/word/2010/wordprocessingDrawing" xmlns:wp="http://schemas.openxmlformats.org/drawingml/2006/wordprocessingDrawing" xmlns:w10="urn:schemas-microsoft-com:office:word" xmlns:w="http://schemas.openxmlformats.org/wordprocessingml/2006/main" xmlns:w14="http://schemas.microsoft.com/office/word/2010/wordml" xmlns:w15="http://schemas.microsoft.com/office/word/2012/wordml" xmlns:w16cex="http://schemas.microsoft.com/office/word/2018/wordml/cex" xmlns:w16cid="http://schemas.microsoft.com/office/word/2016/wordml/cid" xmlns:w16="http://schemas.microsoft.com/office/word/2018/wordml" xmlns:w16du="http://schemas.microsoft.com/office/word/2023/wordml/word16du" xmlns:w16sdtdh="http://schemas.microsoft.com/office/word/2020/wordml/sdtdatahash" xmlns:w16sdtfl="http://schemas.microsoft.com/office/word/2024/wordml/sdtformatlock" xmlns:w16se="http://schemas.microsoft.com/office/word/2015/wordml/symex" xmlns:wpg="http://schemas.microsoft.com/office/word/2010/wordprocessingGroup" xmlns:wpi="http://schemas.microsoft.com/office/word/2010/wordprocessingInk" xmlns:wne="http://schemas.microsoft.com/office/word/2006/wordml" xmlns:wps="http://schemas.microsoft.com/office/word/2010/wordprocessingShape" mc:Ignorable="w14 w15 w16se w16cid w16 w16cex w16sdtdh w16sdtfl w16du wp14">
+  <w15:person w15:author="Alexis Brieant">
+    <w15:presenceInfo w15:providerId="AD" w15:userId="S::abrieant@uvm.edu::ce4610ef-dbc7-4f28-9356-af18629ba17e"/>
+  </w15:person>
+</w15:people>
 </file>
 
 <file path=word/styles.xml><?xml version="1.0" encoding="utf-8"?>
@@ -3082,6 +4107,77 @@
       </w:tblBorders>
     </w:tblPr>
   </w:style>
+  <w:style w:type="character" w:styleId="CommentReference">
+    <w:name w:val="annotation reference"/>
+    <w:basedOn w:val="DefaultParagraphFont"/>
+    <w:uiPriority w:val="99"/>
+    <w:semiHidden/>
+    <w:unhideWhenUsed/>
+    <w:rsid w:val="00174B96"/>
+    <w:rPr>
+      <w:sz w:val="16"/>
+      <w:szCs w:val="16"/>
+    </w:rPr>
+  </w:style>
+  <w:style w:type="paragraph" w:styleId="CommentText">
+    <w:name w:val="annotation text"/>
+    <w:basedOn w:val="Normal"/>
+    <w:link w:val="CommentTextChar"/>
+    <w:uiPriority w:val="99"/>
+    <w:semiHidden/>
+    <w:unhideWhenUsed/>
+    <w:rsid w:val="00174B96"/>
+    <w:rPr>
+      <w:sz w:val="20"/>
+      <w:szCs w:val="20"/>
+    </w:rPr>
+  </w:style>
+  <w:style w:type="character" w:customStyle="1" w:styleId="CommentTextChar">
+    <w:name w:val="Comment Text Char"/>
+    <w:basedOn w:val="DefaultParagraphFont"/>
+    <w:link w:val="CommentText"/>
+    <w:uiPriority w:val="99"/>
+    <w:semiHidden/>
+    <w:rsid w:val="00174B96"/>
+    <w:rPr>
+      <w:rFonts w:ascii="Times New Roman" w:eastAsia="Times New Roman" w:hAnsi="Times New Roman" w:cs="Times New Roman"/>
+      <w:kern w:val="0"/>
+      <w:sz w:val="20"/>
+      <w:szCs w:val="20"/>
+      <w14:ligatures w14:val="none"/>
+    </w:rPr>
+  </w:style>
+  <w:style w:type="paragraph" w:styleId="CommentSubject">
+    <w:name w:val="annotation subject"/>
+    <w:basedOn w:val="CommentText"/>
+    <w:next w:val="CommentText"/>
+    <w:link w:val="CommentSubjectChar"/>
+    <w:uiPriority w:val="99"/>
+    <w:semiHidden/>
+    <w:unhideWhenUsed/>
+    <w:rsid w:val="00174B96"/>
+    <w:rPr>
+      <w:b/>
+      <w:bCs/>
+    </w:rPr>
+  </w:style>
+  <w:style w:type="character" w:customStyle="1" w:styleId="CommentSubjectChar">
+    <w:name w:val="Comment Subject Char"/>
+    <w:basedOn w:val="CommentTextChar"/>
+    <w:link w:val="CommentSubject"/>
+    <w:uiPriority w:val="99"/>
+    <w:semiHidden/>
+    <w:rsid w:val="00174B96"/>
+    <w:rPr>
+      <w:rFonts w:ascii="Times New Roman" w:eastAsia="Times New Roman" w:hAnsi="Times New Roman" w:cs="Times New Roman"/>
+      <w:b/>
+      <w:bCs/>
+      <w:kern w:val="0"/>
+      <w:sz w:val="20"/>
+      <w:szCs w:val="20"/>
+      <w14:ligatures w14:val="none"/>
+    </w:rPr>
+  </w:style>
 </w:styles>
 </file>
 

</xml_diff>